<commit_message>
Half done MiSPISiT Lab 1
</commit_message>
<xml_diff>
--- a/МиСПИСиТ/Лабораторная работа #1/Лабораторная работа 1.docx
+++ b/МиСПИСиТ/Лабораторная работа #1/Лабораторная работа 1.docx
@@ -1,6 +1,6 @@
 
 <file path=word/document.xml><?xml version="1.0" encoding="utf-8"?>
-<w:document xmlns:wpc="http://schemas.microsoft.com/office/word/2010/wordprocessingCanvas" xmlns:cx="http://schemas.microsoft.com/office/drawing/2014/chartex" xmlns:cx1="http://schemas.microsoft.com/office/drawing/2015/9/8/chartex" xmlns:cx2="http://schemas.microsoft.com/office/drawing/2015/10/21/chartex" xmlns:cx3="http://schemas.microsoft.com/office/drawing/2016/5/9/chartex" xmlns:cx4="http://schemas.microsoft.com/office/drawing/2016/5/10/chartex" xmlns:cx5="http://schemas.microsoft.com/office/drawing/2016/5/11/chartex" xmlns:cx6="http://schemas.microsoft.com/office/drawing/2016/5/12/chartex" xmlns:cx7="http://schemas.microsoft.com/office/drawing/2016/5/13/chartex" xmlns:cx8="http://schemas.microsoft.com/office/drawing/2016/5/14/chartex" xmlns:mc="http://schemas.openxmlformats.org/markup-compatibility/2006" xmlns:aink="http://schemas.microsoft.com/office/drawing/2016/ink" xmlns:am3d="http://schemas.microsoft.com/office/drawing/2017/model3d" xmlns:o="urn:schemas-microsoft-com:office:office" xmlns:oel="http://schemas.microsoft.com/office/2019/extlst" xmlns:r="http://schemas.openxmlformats.org/officeDocument/2006/relationships" xmlns:m="http://schemas.openxmlformats.org/officeDocument/2006/math" xmlns:v="urn:schemas-microsoft-com:vml" xmlns:wp14="http://schemas.microsoft.com/office/word/2010/wordprocessingDrawing" xmlns:wp="http://schemas.openxmlformats.org/drawingml/2006/wordprocessingDrawing" xmlns:w10="urn:schemas-microsoft-com:office:word" xmlns:w="http://schemas.openxmlformats.org/wordprocessingml/2006/main" xmlns:w14="http://schemas.microsoft.com/office/word/2010/wordml" xmlns:w15="http://schemas.microsoft.com/office/word/2012/wordml" xmlns:w16cex="http://schemas.microsoft.com/office/word/2018/wordml/cex" xmlns:w16cid="http://schemas.microsoft.com/office/word/2016/wordml/cid" xmlns:w16="http://schemas.microsoft.com/office/word/2018/wordml" xmlns:w16du="http://schemas.microsoft.com/office/word/2023/wordml/word16du" xmlns:w16sdtdh="http://schemas.microsoft.com/office/word/2020/wordml/sdtdatahash" xmlns:w16sdtfl="http://schemas.microsoft.com/office/word/2024/wordml/sdtformatlock" xmlns:w16se="http://schemas.microsoft.com/office/word/2015/wordml/symex" xmlns:wpg="http://schemas.microsoft.com/office/word/2010/wordprocessingGroup" xmlns:wpi="http://schemas.microsoft.com/office/word/2010/wordprocessingInk" xmlns:wne="http://schemas.microsoft.com/office/word/2006/wordml" xmlns:wps="http://schemas.microsoft.com/office/word/2010/wordprocessingShape" mc:Ignorable="w14 w15 w16se w16cid w16 w16cex w16sdtdh w16sdtfl w16du wp14">
+<w:document xmlns:wpc="http://schemas.microsoft.com/office/word/2010/wordprocessingCanvas" xmlns:cx="http://schemas.microsoft.com/office/drawing/2014/chartex" xmlns:cx1="http://schemas.microsoft.com/office/drawing/2015/9/8/chartex" xmlns:cx2="http://schemas.microsoft.com/office/drawing/2015/10/21/chartex" xmlns:cx3="http://schemas.microsoft.com/office/drawing/2016/5/9/chartex" xmlns:cx4="http://schemas.microsoft.com/office/drawing/2016/5/10/chartex" xmlns:cx5="http://schemas.microsoft.com/office/drawing/2016/5/11/chartex" xmlns:cx6="http://schemas.microsoft.com/office/drawing/2016/5/12/chartex" xmlns:cx7="http://schemas.microsoft.com/office/drawing/2016/5/13/chartex" xmlns:cx8="http://schemas.microsoft.com/office/drawing/2016/5/14/chartex" xmlns:mc="http://schemas.openxmlformats.org/markup-compatibility/2006" xmlns:aink="http://schemas.microsoft.com/office/drawing/2016/ink" xmlns:am3d="http://schemas.microsoft.com/office/drawing/2017/model3d" xmlns:o="urn:schemas-microsoft-com:office:office" xmlns:r="http://schemas.openxmlformats.org/officeDocument/2006/relationships" xmlns:m="http://schemas.openxmlformats.org/officeDocument/2006/math" xmlns:v="urn:schemas-microsoft-com:vml" xmlns:wp14="http://schemas.microsoft.com/office/word/2010/wordprocessingDrawing" xmlns:wp="http://schemas.openxmlformats.org/drawingml/2006/wordprocessingDrawing" xmlns:w10="urn:schemas-microsoft-com:office:word" xmlns:w="http://schemas.openxmlformats.org/wordprocessingml/2006/main" xmlns:w14="http://schemas.microsoft.com/office/word/2010/wordml" xmlns:w15="http://schemas.microsoft.com/office/word/2012/wordml" xmlns:w16cex="http://schemas.microsoft.com/office/word/2018/wordml/cex" xmlns:w16cid="http://schemas.microsoft.com/office/word/2016/wordml/cid" xmlns:w16="http://schemas.microsoft.com/office/word/2018/wordml" xmlns:w16sdtdh="http://schemas.microsoft.com/office/word/2020/wordml/sdtdatahash" xmlns:w16se="http://schemas.microsoft.com/office/word/2015/wordml/symex" xmlns:wpg="http://schemas.microsoft.com/office/word/2010/wordprocessingGroup" xmlns:wpi="http://schemas.microsoft.com/office/word/2010/wordprocessingInk" xmlns:wne="http://schemas.microsoft.com/office/word/2006/wordml" xmlns:wps="http://schemas.microsoft.com/office/word/2010/wordprocessingShape" mc:Ignorable="w14 w15 w16se w16cid w16 w16cex w16sdtdh wp14">
   <w:body>
     <w:p>
       <w:pPr>
@@ -218,10 +218,10 @@
         <w:t xml:space="preserve">1.2 - </w:t>
       </w:r>
       <w:r>
-        <w:t xml:space="preserve">Исходя из количественной оценки обучающихся группы был выбран Вариант 2 – </w:t>
-      </w:r>
-      <w:r>
-        <w:t>Регистратура лечебного учреждения</w:t>
+        <w:t xml:space="preserve">Исходя из </w:t>
+      </w:r>
+      <w:r>
+        <w:t>постановки задачи будет рассмотрена информационная система видеоигры</w:t>
       </w:r>
       <w:r>
         <w:t>. Дальнейшее выполнение происходит в блоке задач лабораторной работы.</w:t>
@@ -504,147 +504,80 @@
     </w:p>
     <w:p>
       <w:r>
-        <w:t xml:space="preserve">Так в физической регистратуре, пациент или группа пациентов производит событие </w:t>
-      </w:r>
-      <w:r>
-        <w:t>“</w:t>
-      </w:r>
-      <w:r>
-        <w:t>Запись на приём</w:t>
-      </w:r>
-      <w:r>
-        <w:t>”</w:t>
-      </w:r>
-      <w:r>
-        <w:t>, которая расходится на 2 потока данных</w:t>
+        <w:t xml:space="preserve">Так </w:t>
+      </w:r>
+      <w:r>
+        <w:t>существует некоторый игрок, который получил в собственное распоряжение копию видеоигры. Игрок может производить взаимодействие с системой, через ввод с клавиатуры и мыши. Существует и команды разработчиков и тестировки, которые модифицируют данную систему</w:t>
+      </w:r>
+      <w:r>
+        <w:t>.</w:t>
+      </w:r>
+    </w:p>
+    <w:p>
+      <w:r>
+        <w:t xml:space="preserve">Исходя из анализа внешних событий </w:t>
+      </w:r>
+      <w:r>
+        <w:t>для формировани</w:t>
+      </w:r>
+      <w:r>
+        <w:t>я</w:t>
+      </w:r>
+      <w:r>
+        <w:t xml:space="preserve"> диаграммы нам </w:t>
+      </w:r>
+      <w:r>
+        <w:t>по</w:t>
+      </w:r>
+      <w:r>
+        <w:t xml:space="preserve">требуются </w:t>
+      </w:r>
+      <w:r>
+        <w:t>3</w:t>
+      </w:r>
+      <w:r>
+        <w:t xml:space="preserve"> </w:t>
+      </w:r>
+      <w:r>
+        <w:t xml:space="preserve">внешние </w:t>
+      </w:r>
+      <w:r>
+        <w:t>сущности</w:t>
       </w:r>
       <w:r>
         <w:t>:</w:t>
       </w:r>
-      <w:r>
-        <w:t xml:space="preserve"> </w:t>
-      </w:r>
-      <w:r>
-        <w:t xml:space="preserve">выходные </w:t>
-      </w:r>
-      <w:r>
-        <w:t>“</w:t>
-      </w:r>
-      <w:r>
-        <w:t>Успешная запись</w:t>
-      </w:r>
-      <w:r>
-        <w:t>”</w:t>
-      </w:r>
-      <w:r>
-        <w:t xml:space="preserve"> </w:t>
-      </w:r>
-      <w:r>
-        <w:t xml:space="preserve">и поток </w:t>
-      </w:r>
-      <w:r>
-        <w:t>“</w:t>
-      </w:r>
-      <w:r>
-        <w:t>Заявка</w:t>
-      </w:r>
-      <w:r>
-        <w:t xml:space="preserve"> на запись</w:t>
-      </w:r>
-      <w:r>
-        <w:t xml:space="preserve"> </w:t>
+    </w:p>
+    <w:p>
+      <w:r>
+        <w:t>- Игрок(</w:t>
       </w:r>
       <w:r>
         <w:t>/</w:t>
       </w:r>
       <w:r>
-        <w:t>Откорректированная заявка</w:t>
-      </w:r>
-      <w:r>
-        <w:t>”</w:t>
-      </w:r>
-      <w:r>
-        <w:t xml:space="preserve"> на событие</w:t>
-      </w:r>
-      <w:r>
-        <w:t xml:space="preserve"> </w:t>
-      </w:r>
-      <w:r>
-        <w:t>“</w:t>
-      </w:r>
-      <w:r>
-        <w:t>Корректирование заявки на запись</w:t>
-      </w:r>
-      <w:r>
-        <w:t>”</w:t>
-      </w:r>
-      <w:r>
-        <w:t xml:space="preserve">, она же отправляет поток </w:t>
-      </w:r>
-      <w:r>
-        <w:t>“</w:t>
-      </w:r>
-      <w:r>
-        <w:t>Неоткорректированная заявка</w:t>
-      </w:r>
-      <w:r>
-        <w:t>/</w:t>
-      </w:r>
-      <w:r>
-        <w:t>Корректирующий список</w:t>
-      </w:r>
-      <w:r>
-        <w:t>”</w:t>
-      </w:r>
-      <w:r>
-        <w:t xml:space="preserve"> на событие</w:t>
-      </w:r>
-      <w:r>
-        <w:t xml:space="preserve"> </w:t>
-      </w:r>
-      <w:r>
-        <w:t>“</w:t>
-      </w:r>
-      <w:r>
-        <w:t>Обработка заявки на запись</w:t>
-      </w:r>
-      <w:r>
-        <w:t>”</w:t>
-      </w:r>
-      <w:r>
-        <w:t xml:space="preserve"> генерируемое медицинским регистратором</w:t>
-      </w:r>
-      <w:r>
-        <w:t>. В программной среде выполнять роль медицинского регистратора будет исполнять программный код, но это никак не влияет на генерируемые события, поэтому название сущности остаётся</w:t>
-      </w:r>
-      <w:r>
-        <w:t xml:space="preserve">. </w:t>
-      </w:r>
-    </w:p>
-    <w:p>
-      <w:r>
-        <w:t xml:space="preserve">Исходя из анализа внешних событий </w:t>
-      </w:r>
-      <w:r>
-        <w:t>для формировани</w:t>
-      </w:r>
-      <w:r>
-        <w:t>я</w:t>
-      </w:r>
-      <w:r>
-        <w:t xml:space="preserve"> диаграммы нам </w:t>
-      </w:r>
-      <w:r>
-        <w:t>по</w:t>
-      </w:r>
-      <w:r>
-        <w:t xml:space="preserve">требуются 2 </w:t>
-      </w:r>
-      <w:r>
-        <w:t xml:space="preserve">внешние </w:t>
-      </w:r>
-      <w:r>
-        <w:t>сущности</w:t>
+        <w:t>и)</w:t>
+      </w:r>
+    </w:p>
+    <w:p>
+      <w:r>
+        <w:t xml:space="preserve">- </w:t>
+      </w:r>
+      <w:r>
+        <w:t>Команда разработчиков</w:t>
+      </w:r>
+    </w:p>
+    <w:p>
+      <w:r>
+        <w:t xml:space="preserve">- </w:t>
+      </w:r>
+      <w:r>
+        <w:t>Команда тестировки</w:t>
+      </w:r>
+    </w:p>
+    <w:p>
+      <w:r>
+        <w:t>Производят они внешнее событие</w:t>
       </w:r>
       <w:r>
         <w:t>:</w:t>
@@ -652,23 +585,13 @@
     </w:p>
     <w:p>
       <w:r>
-        <w:t xml:space="preserve">- </w:t>
-      </w:r>
-      <w:r>
-        <w:t>Группа пациентов</w:t>
-      </w:r>
-    </w:p>
-    <w:p>
-      <w:r>
-        <w:t>- Группа медицинских</w:t>
-      </w:r>
-      <w:r>
-        <w:t xml:space="preserve"> </w:t>
-      </w:r>
-      <w:r>
-        <w:t>регистраторов</w:t>
-      </w:r>
-    </w:p>
+        <w:t>- Взаимодействие и модификация системы</w:t>
+      </w:r>
+      <w:r>
+        <w:t>.</w:t>
+      </w:r>
+    </w:p>
+    <w:p/>
     <w:p>
       <w:r>
         <w:lastRenderedPageBreak/>
@@ -681,15 +604,7 @@
         <w:t>лен</w:t>
       </w:r>
       <w:r>
-        <w:t xml:space="preserve"> список событий – описаний действий внешних сущностей и соответствующих реакций системы на события.</w:t>
-      </w:r>
-    </w:p>
-    <w:p>
-      <w:r>
-        <w:t xml:space="preserve">Исходя из </w:t>
-      </w:r>
-      <w:r>
-        <w:t>анализа выше уже имеется 3 события</w:t>
+        <w:t xml:space="preserve"> список событий – описаний действий внешних сущностей и соответствующих реакций системы на события</w:t>
       </w:r>
       <w:r>
         <w:t>:</w:t>
@@ -707,13 +622,16 @@
         </w:rPr>
       </w:pPr>
       <w:r>
+        <w:t xml:space="preserve">Игрок - </w:t>
+      </w:r>
+      <w:r>
         <w:rPr>
           <w:lang w:val="en-US"/>
         </w:rPr>
         <w:t>“</w:t>
       </w:r>
       <w:r>
-        <w:t>Запись на приём</w:t>
+        <w:t>Взаимодействие с игрой</w:t>
       </w:r>
       <w:r>
         <w:rPr>
@@ -734,13 +652,19 @@
         </w:rPr>
       </w:pPr>
       <w:r>
+        <w:t xml:space="preserve">Команда тестирования - </w:t>
+      </w:r>
+      <w:r>
         <w:rPr>
           <w:lang w:val="en-US"/>
         </w:rPr>
         <w:t>“</w:t>
       </w:r>
       <w:r>
-        <w:t>Корректирование заявки на запись</w:t>
+        <w:t>Тестирование видеоигр</w:t>
+      </w:r>
+      <w:r>
+        <w:t>ы</w:t>
       </w:r>
       <w:r>
         <w:rPr>
@@ -756,23 +680,71 @@
           <w:ilvl w:val="0"/>
           <w:numId w:val="2"/>
         </w:numPr>
+      </w:pPr>
+      <w:r>
+        <w:t xml:space="preserve">Команда тестирования - </w:t>
+      </w:r>
+      <w:r>
+        <w:t>“</w:t>
+      </w:r>
+      <w:r>
+        <w:t>Создание тест. последовательности</w:t>
+      </w:r>
+      <w:r>
+        <w:t>”</w:t>
+      </w:r>
+    </w:p>
+    <w:p>
+      <w:pPr>
+        <w:pStyle w:val="ab"/>
+        <w:numPr>
+          <w:ilvl w:val="0"/>
+          <w:numId w:val="2"/>
+        </w:numPr>
         <w:rPr>
           <w:lang w:val="en-US"/>
         </w:rPr>
       </w:pPr>
       <w:r>
+        <w:t xml:space="preserve">Команда разработки - </w:t>
+      </w:r>
+      <w:r>
         <w:rPr>
           <w:lang w:val="en-US"/>
         </w:rPr>
         <w:t>“</w:t>
       </w:r>
       <w:r>
-        <w:t>Обработка заявки на запись</w:t>
+        <w:t xml:space="preserve">Коррекция </w:t>
+      </w:r>
+      <w:r>
+        <w:t>багов</w:t>
       </w:r>
       <w:r>
         <w:rPr>
           <w:lang w:val="en-US"/>
         </w:rPr>
+        <w:t>”</w:t>
+      </w:r>
+    </w:p>
+    <w:p>
+      <w:pPr>
+        <w:pStyle w:val="ab"/>
+        <w:numPr>
+          <w:ilvl w:val="0"/>
+          <w:numId w:val="2"/>
+        </w:numPr>
+      </w:pPr>
+      <w:r>
+        <w:t xml:space="preserve">Команда разработки - </w:t>
+      </w:r>
+      <w:r>
+        <w:t>“</w:t>
+      </w:r>
+      <w:r>
+        <w:t>Модификация видеоигрового процесса</w:t>
+      </w:r>
+      <w:r>
         <w:t>”</w:t>
       </w:r>
     </w:p>
@@ -840,16 +812,16 @@
       </w:tblPr>
       <w:tblGrid>
         <w:gridCol w:w="426"/>
-        <w:gridCol w:w="1527"/>
-        <w:gridCol w:w="2405"/>
+        <w:gridCol w:w="1506"/>
+        <w:gridCol w:w="2333"/>
         <w:gridCol w:w="1193"/>
-        <w:gridCol w:w="1451"/>
-        <w:gridCol w:w="2632"/>
+        <w:gridCol w:w="1749"/>
+        <w:gridCol w:w="2427"/>
       </w:tblGrid>
       <w:tr>
         <w:tc>
           <w:tcPr>
-            <w:tcW w:w="424" w:type="dxa"/>
+            <w:tcW w:w="426" w:type="dxa"/>
           </w:tcPr>
           <w:p>
             <w:pPr>
@@ -872,7 +844,7 @@
         </w:tc>
         <w:tc>
           <w:tcPr>
-            <w:tcW w:w="1517" w:type="dxa"/>
+            <w:tcW w:w="1513" w:type="dxa"/>
           </w:tcPr>
           <w:p>
             <w:pPr>
@@ -895,7 +867,7 @@
         </w:tc>
         <w:tc>
           <w:tcPr>
-            <w:tcW w:w="2388" w:type="dxa"/>
+            <w:tcW w:w="2405" w:type="dxa"/>
           </w:tcPr>
           <w:p>
             <w:pPr>
@@ -918,7 +890,7 @@
         </w:tc>
         <w:tc>
           <w:tcPr>
-            <w:tcW w:w="1186" w:type="dxa"/>
+            <w:tcW w:w="1193" w:type="dxa"/>
           </w:tcPr>
           <w:p>
             <w:pPr>
@@ -941,7 +913,7 @@
         </w:tc>
         <w:tc>
           <w:tcPr>
-            <w:tcW w:w="1442" w:type="dxa"/>
+            <w:tcW w:w="1451" w:type="dxa"/>
           </w:tcPr>
           <w:p>
             <w:pPr>
@@ -964,7 +936,7 @@
         </w:tc>
         <w:tc>
           <w:tcPr>
-            <w:tcW w:w="2677" w:type="dxa"/>
+            <w:tcW w:w="2646" w:type="dxa"/>
           </w:tcPr>
           <w:p>
             <w:pPr>
@@ -992,7 +964,7 @@
         </w:trPr>
         <w:tc>
           <w:tcPr>
-            <w:tcW w:w="424" w:type="dxa"/>
+            <w:tcW w:w="426" w:type="dxa"/>
             <w:vMerge w:val="restart"/>
             <w:vAlign w:val="center"/>
           </w:tcPr>
@@ -1017,7 +989,7 @@
         </w:tc>
         <w:tc>
           <w:tcPr>
-            <w:tcW w:w="1517" w:type="dxa"/>
+            <w:tcW w:w="1513" w:type="dxa"/>
             <w:vMerge w:val="restart"/>
             <w:vAlign w:val="center"/>
           </w:tcPr>
@@ -1036,13 +1008,13 @@
                 <w:sz w:val="22"/>
                 <w:szCs w:val="22"/>
               </w:rPr>
-              <w:t>Пациент</w:t>
+              <w:t>Игрок</w:t>
             </w:r>
           </w:p>
         </w:tc>
         <w:tc>
           <w:tcPr>
-            <w:tcW w:w="2388" w:type="dxa"/>
+            <w:tcW w:w="2405" w:type="dxa"/>
             <w:vAlign w:val="center"/>
           </w:tcPr>
           <w:p>
@@ -1060,13 +1032,13 @@
                 <w:sz w:val="22"/>
                 <w:szCs w:val="22"/>
               </w:rPr>
-              <w:t>Записывается на приём</w:t>
+              <w:t>Производит отслеживаемый системой ввод</w:t>
             </w:r>
           </w:p>
         </w:tc>
         <w:tc>
           <w:tcPr>
-            <w:tcW w:w="1186" w:type="dxa"/>
+            <w:tcW w:w="1193" w:type="dxa"/>
             <w:vAlign w:val="center"/>
           </w:tcPr>
           <w:p>
@@ -1090,7 +1062,7 @@
         </w:tc>
         <w:tc>
           <w:tcPr>
-            <w:tcW w:w="1442" w:type="dxa"/>
+            <w:tcW w:w="1451" w:type="dxa"/>
             <w:vMerge w:val="restart"/>
             <w:vAlign w:val="center"/>
           </w:tcPr>
@@ -1109,13 +1081,13 @@
                 <w:sz w:val="22"/>
                 <w:szCs w:val="22"/>
               </w:rPr>
-              <w:t>Регистратура лечебного учреждения</w:t>
+              <w:t>Взаимодействие с игрой</w:t>
             </w:r>
           </w:p>
         </w:tc>
         <w:tc>
           <w:tcPr>
-            <w:tcW w:w="2677" w:type="dxa"/>
+            <w:tcW w:w="2646" w:type="dxa"/>
             <w:vAlign w:val="center"/>
           </w:tcPr>
           <w:p>
@@ -1133,14 +1105,7 @@
                 <w:sz w:val="22"/>
                 <w:szCs w:val="22"/>
               </w:rPr>
-              <w:t xml:space="preserve">Оправляет запись </w:t>
-            </w:r>
-            <w:r>
-              <w:rPr>
-                <w:sz w:val="22"/>
-                <w:szCs w:val="22"/>
-              </w:rPr>
-              <w:t>в систему корректирования</w:t>
+              <w:t>Даёт отклик пользователю</w:t>
             </w:r>
           </w:p>
         </w:tc>
@@ -1151,7 +1116,7 @@
         </w:trPr>
         <w:tc>
           <w:tcPr>
-            <w:tcW w:w="424" w:type="dxa"/>
+            <w:tcW w:w="426" w:type="dxa"/>
             <w:vMerge/>
             <w:vAlign w:val="center"/>
           </w:tcPr>
@@ -1169,7 +1134,7 @@
         </w:tc>
         <w:tc>
           <w:tcPr>
-            <w:tcW w:w="1517" w:type="dxa"/>
+            <w:tcW w:w="1513" w:type="dxa"/>
             <w:vMerge/>
             <w:vAlign w:val="center"/>
           </w:tcPr>
@@ -1187,7 +1152,7 @@
         </w:tc>
         <w:tc>
           <w:tcPr>
-            <w:tcW w:w="2388" w:type="dxa"/>
+            <w:tcW w:w="2405" w:type="dxa"/>
             <w:vAlign w:val="center"/>
           </w:tcPr>
           <w:p>
@@ -1205,13 +1170,20 @@
                 <w:sz w:val="22"/>
                 <w:szCs w:val="22"/>
               </w:rPr>
-              <w:t>Получает успешную запись</w:t>
+              <w:t xml:space="preserve">Получает </w:t>
             </w:r>
-          </w:p>
-        </w:tc>
-        <w:tc>
-          <w:tcPr>
-            <w:tcW w:w="1186" w:type="dxa"/>
+            <w:r>
+              <w:rPr>
+                <w:sz w:val="22"/>
+                <w:szCs w:val="22"/>
+              </w:rPr>
+              <w:t>отклик на действие</w:t>
+            </w:r>
+          </w:p>
+        </w:tc>
+        <w:tc>
+          <w:tcPr>
+            <w:tcW w:w="1193" w:type="dxa"/>
             <w:vAlign w:val="center"/>
           </w:tcPr>
           <w:p>
@@ -1235,7 +1207,7 @@
         </w:tc>
         <w:tc>
           <w:tcPr>
-            <w:tcW w:w="1442" w:type="dxa"/>
+            <w:tcW w:w="1451" w:type="dxa"/>
             <w:vMerge/>
             <w:vAlign w:val="center"/>
           </w:tcPr>
@@ -1253,7 +1225,7 @@
         </w:tc>
         <w:tc>
           <w:tcPr>
-            <w:tcW w:w="2677" w:type="dxa"/>
+            <w:tcW w:w="2646" w:type="dxa"/>
             <w:vAlign w:val="center"/>
           </w:tcPr>
           <w:p>
@@ -1271,7 +1243,7 @@
                 <w:sz w:val="22"/>
                 <w:szCs w:val="22"/>
               </w:rPr>
-              <w:t>Выдаёт откорректированную запись</w:t>
+              <w:t>Продолжает отслеживание</w:t>
             </w:r>
           </w:p>
         </w:tc>
@@ -1282,7 +1254,7 @@
         </w:trPr>
         <w:tc>
           <w:tcPr>
-            <w:tcW w:w="424" w:type="dxa"/>
+            <w:tcW w:w="426" w:type="dxa"/>
             <w:vMerge w:val="restart"/>
             <w:vAlign w:val="center"/>
           </w:tcPr>
@@ -1307,7 +1279,7 @@
         </w:tc>
         <w:tc>
           <w:tcPr>
-            <w:tcW w:w="1517" w:type="dxa"/>
+            <w:tcW w:w="1513" w:type="dxa"/>
             <w:vMerge w:val="restart"/>
             <w:vAlign w:val="center"/>
           </w:tcPr>
@@ -1326,13 +1298,13 @@
                 <w:sz w:val="22"/>
                 <w:szCs w:val="22"/>
               </w:rPr>
-              <w:t>Медицинский регистратор</w:t>
+              <w:t>Команда тестирования</w:t>
             </w:r>
           </w:p>
         </w:tc>
         <w:tc>
           <w:tcPr>
-            <w:tcW w:w="2388" w:type="dxa"/>
+            <w:tcW w:w="2405" w:type="dxa"/>
             <w:vAlign w:val="center"/>
           </w:tcPr>
           <w:p>
@@ -1350,13 +1322,13 @@
                 <w:sz w:val="22"/>
                 <w:szCs w:val="22"/>
               </w:rPr>
-              <w:t>Принимает неоткорректированную запись</w:t>
+              <w:t>Производит нетипичный ввод</w:t>
             </w:r>
           </w:p>
         </w:tc>
         <w:tc>
           <w:tcPr>
-            <w:tcW w:w="1186" w:type="dxa"/>
+            <w:tcW w:w="1193" w:type="dxa"/>
             <w:vAlign w:val="center"/>
           </w:tcPr>
           <w:p>
@@ -1380,7 +1352,7 @@
         </w:tc>
         <w:tc>
           <w:tcPr>
-            <w:tcW w:w="1442" w:type="dxa"/>
+            <w:tcW w:w="1451" w:type="dxa"/>
             <w:vMerge w:val="restart"/>
             <w:vAlign w:val="center"/>
           </w:tcPr>
@@ -1399,13 +1371,13 @@
                 <w:sz w:val="22"/>
                 <w:szCs w:val="22"/>
               </w:rPr>
-              <w:t>Регистратура лечебного учреждения</w:t>
+              <w:t>Взаимодействие с игрой</w:t>
             </w:r>
           </w:p>
         </w:tc>
         <w:tc>
           <w:tcPr>
-            <w:tcW w:w="2677" w:type="dxa"/>
+            <w:tcW w:w="2646" w:type="dxa"/>
             <w:vAlign w:val="center"/>
           </w:tcPr>
           <w:p>
@@ -1423,7 +1395,7 @@
                 <w:sz w:val="22"/>
                 <w:szCs w:val="22"/>
               </w:rPr>
-              <w:t>Отдаёт неоткорректированную запись</w:t>
+              <w:t>Даёт сломанный отклик</w:t>
             </w:r>
           </w:p>
         </w:tc>
@@ -1434,7 +1406,7 @@
         </w:trPr>
         <w:tc>
           <w:tcPr>
-            <w:tcW w:w="424" w:type="dxa"/>
+            <w:tcW w:w="426" w:type="dxa"/>
             <w:vMerge/>
             <w:vAlign w:val="center"/>
           </w:tcPr>
@@ -1452,7 +1424,7 @@
         </w:tc>
         <w:tc>
           <w:tcPr>
-            <w:tcW w:w="1517" w:type="dxa"/>
+            <w:tcW w:w="1513" w:type="dxa"/>
             <w:vMerge/>
             <w:vAlign w:val="center"/>
           </w:tcPr>
@@ -1470,7 +1442,7 @@
         </w:tc>
         <w:tc>
           <w:tcPr>
-            <w:tcW w:w="2388" w:type="dxa"/>
+            <w:tcW w:w="2405" w:type="dxa"/>
             <w:vAlign w:val="center"/>
           </w:tcPr>
           <w:p>
@@ -1488,13 +1460,13 @@
                 <w:sz w:val="22"/>
                 <w:szCs w:val="22"/>
               </w:rPr>
-              <w:t>Отсылает корректировки в систему</w:t>
+              <w:t>Производит тестирующую последовательность для корректного отклика</w:t>
             </w:r>
           </w:p>
         </w:tc>
         <w:tc>
           <w:tcPr>
-            <w:tcW w:w="1186" w:type="dxa"/>
+            <w:tcW w:w="1193" w:type="dxa"/>
             <w:vAlign w:val="center"/>
           </w:tcPr>
           <w:p>
@@ -1518,7 +1490,7 @@
         </w:tc>
         <w:tc>
           <w:tcPr>
-            <w:tcW w:w="1442" w:type="dxa"/>
+            <w:tcW w:w="1451" w:type="dxa"/>
             <w:vMerge/>
             <w:vAlign w:val="center"/>
           </w:tcPr>
@@ -1536,7 +1508,7 @@
         </w:tc>
         <w:tc>
           <w:tcPr>
-            <w:tcW w:w="2677" w:type="dxa"/>
+            <w:tcW w:w="2646" w:type="dxa"/>
             <w:vAlign w:val="center"/>
           </w:tcPr>
           <w:p>
@@ -1554,7 +1526,290 @@
                 <w:sz w:val="22"/>
                 <w:szCs w:val="22"/>
               </w:rPr>
-              <w:t>Принимает корректировки</w:t>
+              <w:t>Проходит тесты</w:t>
+            </w:r>
+          </w:p>
+        </w:tc>
+      </w:tr>
+      <w:tr>
+        <w:trPr>
+          <w:trHeight w:val="1134"/>
+        </w:trPr>
+        <w:tc>
+          <w:tcPr>
+            <w:tcW w:w="426" w:type="dxa"/>
+            <w:vMerge w:val="restart"/>
+            <w:vAlign w:val="center"/>
+          </w:tcPr>
+          <w:p>
+            <w:pPr>
+              <w:spacing w:after="160" w:line="278" w:lineRule="auto"/>
+              <w:ind w:firstLine="0"/>
+              <w:jc w:val="center"/>
+              <w:rPr>
+                <w:sz w:val="22"/>
+                <w:szCs w:val="22"/>
+              </w:rPr>
+            </w:pPr>
+            <w:r>
+              <w:rPr>
+                <w:sz w:val="22"/>
+                <w:szCs w:val="22"/>
+              </w:rPr>
+              <w:t>2</w:t>
+            </w:r>
+          </w:p>
+        </w:tc>
+        <w:tc>
+          <w:tcPr>
+            <w:tcW w:w="1513" w:type="dxa"/>
+            <w:vMerge w:val="restart"/>
+            <w:vAlign w:val="center"/>
+          </w:tcPr>
+          <w:p>
+            <w:pPr>
+              <w:spacing w:after="160" w:line="278" w:lineRule="auto"/>
+              <w:ind w:firstLine="0"/>
+              <w:jc w:val="center"/>
+              <w:rPr>
+                <w:sz w:val="22"/>
+                <w:szCs w:val="22"/>
+              </w:rPr>
+            </w:pPr>
+            <w:r>
+              <w:rPr>
+                <w:sz w:val="22"/>
+                <w:szCs w:val="22"/>
+              </w:rPr>
+              <w:t>Команда разработки</w:t>
+            </w:r>
+          </w:p>
+        </w:tc>
+        <w:tc>
+          <w:tcPr>
+            <w:tcW w:w="2405" w:type="dxa"/>
+            <w:vAlign w:val="center"/>
+          </w:tcPr>
+          <w:p>
+            <w:pPr>
+              <w:spacing w:after="160" w:line="278" w:lineRule="auto"/>
+              <w:ind w:firstLine="0"/>
+              <w:jc w:val="center"/>
+              <w:rPr>
+                <w:sz w:val="22"/>
+                <w:szCs w:val="22"/>
+              </w:rPr>
+            </w:pPr>
+            <w:r>
+              <w:rPr>
+                <w:sz w:val="22"/>
+                <w:szCs w:val="22"/>
+              </w:rPr>
+              <w:t>Производит починку бага</w:t>
+            </w:r>
+          </w:p>
+        </w:tc>
+        <w:tc>
+          <w:tcPr>
+            <w:tcW w:w="1193" w:type="dxa"/>
+            <w:vAlign w:val="center"/>
+          </w:tcPr>
+          <w:p>
+            <w:pPr>
+              <w:spacing w:after="160" w:line="278" w:lineRule="auto"/>
+              <w:ind w:firstLine="0"/>
+              <w:jc w:val="center"/>
+              <w:rPr>
+                <w:sz w:val="22"/>
+                <w:szCs w:val="22"/>
+              </w:rPr>
+            </w:pPr>
+            <w:r>
+              <w:rPr>
+                <w:sz w:val="22"/>
+                <w:szCs w:val="22"/>
+              </w:rPr>
+              <w:t>Типичный</w:t>
+            </w:r>
+          </w:p>
+        </w:tc>
+        <w:tc>
+          <w:tcPr>
+            <w:tcW w:w="1451" w:type="dxa"/>
+            <w:vMerge w:val="restart"/>
+            <w:vAlign w:val="center"/>
+          </w:tcPr>
+          <w:p>
+            <w:pPr>
+              <w:spacing w:after="160" w:line="278" w:lineRule="auto"/>
+              <w:ind w:firstLine="0"/>
+              <w:jc w:val="center"/>
+              <w:rPr>
+                <w:sz w:val="22"/>
+                <w:szCs w:val="22"/>
+              </w:rPr>
+            </w:pPr>
+            <w:r>
+              <w:rPr>
+                <w:sz w:val="22"/>
+                <w:szCs w:val="22"/>
+              </w:rPr>
+              <w:t>Взаимодействие с игрой</w:t>
+            </w:r>
+          </w:p>
+        </w:tc>
+        <w:tc>
+          <w:tcPr>
+            <w:tcW w:w="2646" w:type="dxa"/>
+            <w:vAlign w:val="center"/>
+          </w:tcPr>
+          <w:p>
+            <w:pPr>
+              <w:spacing w:after="160" w:line="278" w:lineRule="auto"/>
+              <w:ind w:firstLine="0"/>
+              <w:jc w:val="center"/>
+              <w:rPr>
+                <w:sz w:val="22"/>
+                <w:szCs w:val="22"/>
+              </w:rPr>
+            </w:pPr>
+            <w:r>
+              <w:rPr>
+                <w:sz w:val="22"/>
+                <w:szCs w:val="22"/>
+              </w:rPr>
+              <w:t>Отрицательный отклик дал положительный</w:t>
+            </w:r>
+          </w:p>
+        </w:tc>
+      </w:tr>
+      <w:tr>
+        <w:trPr>
+          <w:trHeight w:val="1134"/>
+        </w:trPr>
+        <w:tc>
+          <w:tcPr>
+            <w:tcW w:w="426" w:type="dxa"/>
+            <w:vMerge/>
+            <w:vAlign w:val="center"/>
+          </w:tcPr>
+          <w:p>
+            <w:pPr>
+              <w:spacing w:after="160" w:line="278" w:lineRule="auto"/>
+              <w:ind w:firstLine="0"/>
+              <w:jc w:val="center"/>
+              <w:rPr>
+                <w:sz w:val="22"/>
+                <w:szCs w:val="22"/>
+              </w:rPr>
+            </w:pPr>
+          </w:p>
+        </w:tc>
+        <w:tc>
+          <w:tcPr>
+            <w:tcW w:w="1513" w:type="dxa"/>
+            <w:vMerge/>
+            <w:vAlign w:val="center"/>
+          </w:tcPr>
+          <w:p>
+            <w:pPr>
+              <w:spacing w:after="160" w:line="278" w:lineRule="auto"/>
+              <w:ind w:firstLine="0"/>
+              <w:jc w:val="center"/>
+              <w:rPr>
+                <w:sz w:val="22"/>
+                <w:szCs w:val="22"/>
+              </w:rPr>
+            </w:pPr>
+          </w:p>
+        </w:tc>
+        <w:tc>
+          <w:tcPr>
+            <w:tcW w:w="2405" w:type="dxa"/>
+            <w:vAlign w:val="center"/>
+          </w:tcPr>
+          <w:p>
+            <w:pPr>
+              <w:spacing w:after="160" w:line="278" w:lineRule="auto"/>
+              <w:ind w:firstLine="0"/>
+              <w:jc w:val="center"/>
+              <w:rPr>
+                <w:sz w:val="22"/>
+                <w:szCs w:val="22"/>
+              </w:rPr>
+            </w:pPr>
+            <w:r>
+              <w:rPr>
+                <w:sz w:val="22"/>
+                <w:szCs w:val="22"/>
+              </w:rPr>
+              <w:t>Производит модификацию</w:t>
+            </w:r>
+          </w:p>
+        </w:tc>
+        <w:tc>
+          <w:tcPr>
+            <w:tcW w:w="1193" w:type="dxa"/>
+            <w:vAlign w:val="center"/>
+          </w:tcPr>
+          <w:p>
+            <w:pPr>
+              <w:spacing w:after="160" w:line="278" w:lineRule="auto"/>
+              <w:ind w:firstLine="0"/>
+              <w:jc w:val="center"/>
+              <w:rPr>
+                <w:sz w:val="22"/>
+                <w:szCs w:val="22"/>
+              </w:rPr>
+            </w:pPr>
+            <w:r>
+              <w:rPr>
+                <w:sz w:val="22"/>
+                <w:szCs w:val="22"/>
+              </w:rPr>
+              <w:t>Типичный</w:t>
+            </w:r>
+          </w:p>
+        </w:tc>
+        <w:tc>
+          <w:tcPr>
+            <w:tcW w:w="1451" w:type="dxa"/>
+            <w:vMerge/>
+            <w:vAlign w:val="center"/>
+          </w:tcPr>
+          <w:p>
+            <w:pPr>
+              <w:spacing w:after="160" w:line="278" w:lineRule="auto"/>
+              <w:ind w:firstLine="0"/>
+              <w:jc w:val="center"/>
+              <w:rPr>
+                <w:sz w:val="22"/>
+                <w:szCs w:val="22"/>
+              </w:rPr>
+            </w:pPr>
+          </w:p>
+        </w:tc>
+        <w:tc>
+          <w:tcPr>
+            <w:tcW w:w="2646" w:type="dxa"/>
+            <w:vAlign w:val="center"/>
+          </w:tcPr>
+          <w:p>
+            <w:pPr>
+              <w:spacing w:after="160" w:line="278" w:lineRule="auto"/>
+              <w:ind w:firstLine="0"/>
+              <w:jc w:val="center"/>
+              <w:rPr>
+                <w:sz w:val="22"/>
+                <w:szCs w:val="22"/>
+              </w:rPr>
+            </w:pPr>
+            <w:r>
+              <w:rPr>
+                <w:sz w:val="22"/>
+                <w:szCs w:val="22"/>
+              </w:rPr>
+              <w:t>Новые реакции на ранее нетипичные вводы</w:t>
             </w:r>
           </w:p>
         </w:tc>
@@ -1570,16 +1825,7 @@
         <w:spacing w:line="360" w:lineRule="auto"/>
       </w:pPr>
       <w:r>
-        <w:t>2.</w:t>
-      </w:r>
-      <w:r>
-        <w:t>5</w:t>
-      </w:r>
-      <w:r>
-        <w:t xml:space="preserve"> –</w:t>
-      </w:r>
-      <w:r>
-        <w:t xml:space="preserve"> Производится в</w:t>
+        <w:t>2.5 – Производится в</w:t>
       </w:r>
       <w:r>
         <w:t>ыдел</w:t>
@@ -1607,14 +1853,20 @@
       <w:pPr>
         <w:spacing w:line="360" w:lineRule="auto"/>
       </w:pPr>
-      <w:r>
+    </w:p>
+    <w:p>
+      <w:pPr>
+        <w:spacing w:line="360" w:lineRule="auto"/>
+      </w:pPr>
+      <w:r>
+        <w:lastRenderedPageBreak/>
         <w:t xml:space="preserve">Внешняя сущность </w:t>
       </w:r>
       <w:r>
         <w:t>“</w:t>
       </w:r>
       <w:r>
-        <w:t>Пациент</w:t>
+        <w:t>Игрок</w:t>
       </w:r>
       <w:r>
         <w:t>”</w:t>
@@ -1666,7 +1918,16 @@
         <w:t>“</w:t>
       </w:r>
       <w:r>
-        <w:t>Ввод данных записи</w:t>
+        <w:t xml:space="preserve">Ввод </w:t>
+      </w:r>
+      <w:r>
+        <w:t>с клавиатуры</w:t>
+      </w:r>
+      <w:r>
+        <w:t>/</w:t>
+      </w:r>
+      <w:r>
+        <w:t>мыши</w:t>
       </w:r>
       <w:r>
         <w:t>”</w:t>
@@ -1678,7 +1939,7 @@
         <w:t>“</w:t>
       </w:r>
       <w:r>
-        <w:t>Запись на приём</w:t>
+        <w:t>Взаимодействие с игрой</w:t>
       </w:r>
       <w:r>
         <w:t>”</w:t>
@@ -1721,7 +1982,7 @@
         <w:t>“</w:t>
       </w:r>
       <w:r>
-        <w:t>Успешная запись</w:t>
+        <w:t>Визуальный отклик</w:t>
       </w:r>
       <w:r>
         <w:t>”</w:t>
@@ -1736,7 +1997,7 @@
         <w:t>“</w:t>
       </w:r>
       <w:r>
-        <w:t>Запись на приём</w:t>
+        <w:t>Взаимодействие с игрой</w:t>
       </w:r>
       <w:r>
         <w:t>”</w:t>
@@ -1751,15 +2012,15 @@
       <w:pPr>
         <w:spacing w:line="360" w:lineRule="auto"/>
       </w:pPr>
-      <w:r>
-        <w:lastRenderedPageBreak/>
+      <w:bookmarkStart w:id="0" w:name="_Hlk239967994"/>
+      <w:r>
         <w:t xml:space="preserve">Внешняя сущность </w:t>
       </w:r>
       <w:r>
         <w:t>“</w:t>
       </w:r>
       <w:r>
-        <w:t>Медицинский регистратор</w:t>
+        <w:t>Команда тестирования</w:t>
       </w:r>
       <w:r>
         <w:t xml:space="preserve">”: </w:t>
@@ -1768,9 +2029,6 @@
     <w:p>
       <w:pPr>
         <w:spacing w:line="360" w:lineRule="auto"/>
-        <w:rPr>
-          <w:lang w:val="en-US"/>
-        </w:rPr>
       </w:pPr>
       <w:r>
         <w:t>В</w:t>
@@ -1802,7 +2060,7 @@
         <w:t>“</w:t>
       </w:r>
       <w:r>
-        <w:t>Проверка корректности записи</w:t>
+        <w:t>Опыт тестирования</w:t>
       </w:r>
       <w:r>
         <w:t>”</w:t>
@@ -1814,33 +2072,13 @@
         <w:t>“</w:t>
       </w:r>
       <w:r>
-        <w:t>Обработки заявки на запись</w:t>
-      </w:r>
-      <w:r>
-        <w:t>”</w:t>
-      </w:r>
-      <w:r>
-        <w:t xml:space="preserve"> </w:t>
-      </w:r>
-    </w:p>
-    <w:p>
-      <w:pPr>
-        <w:spacing w:line="360" w:lineRule="auto"/>
-      </w:pPr>
-      <w:r>
-        <w:t>В</w:t>
-      </w:r>
-      <w:r>
-        <w:t>ход</w:t>
-      </w:r>
-      <w:r>
-        <w:t>ы</w:t>
-      </w:r>
-      <w:r>
-        <w:t>:</w:t>
-      </w:r>
-      <w:r>
-        <w:t xml:space="preserve"> </w:t>
+        <w:t>Тестировани</w:t>
+      </w:r>
+      <w:r>
+        <w:t>е видеоигры</w:t>
+      </w:r>
+      <w:r>
+        <w:t>”</w:t>
       </w:r>
     </w:p>
     <w:p>
@@ -1857,71 +2095,45 @@
         <w:t>“</w:t>
       </w:r>
       <w:r>
-        <w:t>Завершение сессии</w:t>
-      </w:r>
-      <w:r>
-        <w:t>”</w:t>
-      </w:r>
-      <w:r>
-        <w:t xml:space="preserve"> с события </w:t>
-      </w:r>
-      <w:r>
-        <w:t>“</w:t>
-      </w:r>
-      <w:r>
-        <w:t>Запись на приём</w:t>
-      </w:r>
-      <w:r>
-        <w:t>”</w:t>
-      </w:r>
-      <w:r>
-        <w:t>.</w:t>
+        <w:t>П</w:t>
+      </w:r>
+      <w:r>
+        <w:t>редставлени</w:t>
+      </w:r>
+      <w:r>
+        <w:t>е</w:t>
+      </w:r>
+      <w:r>
+        <w:t xml:space="preserve"> функциональности ПО</w:t>
+      </w:r>
+      <w:r>
+        <w:t>”</w:t>
+      </w:r>
+      <w:r>
+        <w:t xml:space="preserve"> на событие </w:t>
+      </w:r>
+      <w:r>
+        <w:t>“</w:t>
+      </w:r>
+      <w:r>
+        <w:t>Создание тест. последовательности</w:t>
+      </w:r>
+      <w:r>
+        <w:t>”</w:t>
+      </w:r>
+      <w:r>
+        <w:t xml:space="preserve"> </w:t>
       </w:r>
     </w:p>
     <w:p>
       <w:pPr>
         <w:spacing w:line="360" w:lineRule="auto"/>
-        <w:ind w:firstLine="0"/>
-        <w:rPr>
-          <w:lang w:val="en-US"/>
-        </w:rPr>
-      </w:pPr>
-    </w:p>
-    <w:p>
-      <w:pPr>
-        <w:spacing w:line="360" w:lineRule="auto"/>
-        <w:rPr>
-          <w:lang w:val="en-US"/>
-        </w:rPr>
-      </w:pPr>
-      <w:r>
-        <w:t>Событие</w:t>
-      </w:r>
-      <w:r>
-        <w:t xml:space="preserve"> </w:t>
-      </w:r>
-      <w:r>
-        <w:t>“</w:t>
-      </w:r>
-      <w:r>
-        <w:t>Запись на приём</w:t>
-      </w:r>
-      <w:r>
-        <w:t xml:space="preserve">”: </w:t>
-      </w:r>
-    </w:p>
-    <w:p>
-      <w:pPr>
-        <w:spacing w:line="360" w:lineRule="auto"/>
-        <w:rPr>
-          <w:lang w:val="en-US"/>
-        </w:rPr>
       </w:pPr>
       <w:r>
         <w:t>В</w:t>
       </w:r>
       <w:r>
-        <w:t>ыход</w:t>
+        <w:t>ход</w:t>
       </w:r>
       <w:r>
         <w:t>ы</w:t>
@@ -1947,37 +2159,25 @@
         <w:t>“</w:t>
       </w:r>
       <w:r>
-        <w:t>Завершение сессии</w:t>
-      </w:r>
-      <w:r>
-        <w:t>”</w:t>
-      </w:r>
-      <w:r>
-        <w:t xml:space="preserve"> </w:t>
-      </w:r>
-      <w:r>
-        <w:t>на</w:t>
-      </w:r>
-      <w:r>
-        <w:t xml:space="preserve"> </w:t>
-      </w:r>
-      <w:r>
-        <w:t>внешнюю сущность</w:t>
-      </w:r>
-      <w:r>
-        <w:t xml:space="preserve"> </w:t>
-      </w:r>
-      <w:r>
-        <w:t>“</w:t>
-      </w:r>
-      <w:r>
-        <w:t>Мед. регистратор</w:t>
-      </w:r>
-      <w:r>
-        <w:t>”</w:t>
-      </w:r>
-      <w:r>
-        <w:t>,</w:t>
+        <w:t>Отредактированное ПО</w:t>
+      </w:r>
+      <w:r>
+        <w:t>”</w:t>
+      </w:r>
+      <w:r>
+        <w:t xml:space="preserve"> с события </w:t>
+      </w:r>
+      <w:r>
+        <w:t>“</w:t>
+      </w:r>
+      <w:r>
+        <w:t>Тестирование видеоигры</w:t>
+      </w:r>
+      <w:r>
+        <w:t>”</w:t>
+      </w:r>
+      <w:r>
+        <w:t>.</w:t>
       </w:r>
     </w:p>
     <w:p>
@@ -1994,28 +2194,60 @@
         <w:t>“</w:t>
       </w:r>
       <w:r>
-        <w:t>Успешная запись</w:t>
-      </w:r>
-      <w:r>
-        <w:t>”</w:t>
+        <w:t>Положительный отклик</w:t>
+      </w:r>
+      <w:r>
+        <w:t>”</w:t>
+      </w:r>
+      <w:r>
+        <w:t xml:space="preserve"> с события </w:t>
+      </w:r>
+      <w:r>
+        <w:t>“</w:t>
+      </w:r>
+      <w:r>
+        <w:t>Создание тест. последовательности</w:t>
+      </w:r>
+      <w:r>
+        <w:t>”</w:t>
+      </w:r>
+    </w:p>
+    <w:bookmarkEnd w:id="0"/>
+    <w:p>
+      <w:pPr>
+        <w:spacing w:line="360" w:lineRule="auto"/>
+        <w:ind w:firstLine="0"/>
+      </w:pPr>
+    </w:p>
+    <w:p>
+      <w:pPr>
+        <w:spacing w:line="360" w:lineRule="auto"/>
+      </w:pPr>
+      <w:r>
+        <w:t xml:space="preserve">Внешняя сущность </w:t>
+      </w:r>
+      <w:r>
+        <w:t>“</w:t>
+      </w:r>
+      <w:r>
+        <w:t>Команда разработки</w:t>
+      </w:r>
+      <w:r>
+        <w:t xml:space="preserve">”: </w:t>
+      </w:r>
+    </w:p>
+    <w:p>
+      <w:pPr>
+        <w:spacing w:line="360" w:lineRule="auto"/>
+      </w:pPr>
+      <w:r>
+        <w:t>Выходы</w:t>
+      </w:r>
+      <w:r>
+        <w:t>:</w:t>
       </w:r>
       <w:r>
         <w:t xml:space="preserve"> </w:t>
-      </w:r>
-      <w:r>
-        <w:t xml:space="preserve">на внешнюю сущность </w:t>
-      </w:r>
-      <w:r>
-        <w:t>“</w:t>
-      </w:r>
-      <w:r>
-        <w:t>Пациент</w:t>
-      </w:r>
-      <w:r>
-        <w:t>”</w:t>
-      </w:r>
-      <w:r>
-        <w:t>,</w:t>
       </w:r>
     </w:p>
     <w:p>
@@ -2032,7 +2264,7 @@
         <w:t>“</w:t>
       </w:r>
       <w:r>
-        <w:t>Заявка на запись</w:t>
+        <w:t>Опыт в коррекции ПО</w:t>
       </w:r>
       <w:r>
         <w:t>”</w:t>
@@ -2044,36 +2276,10 @@
         <w:t>“</w:t>
       </w:r>
       <w:r>
-        <w:t>Корректировка записи</w:t>
-      </w:r>
-      <w:r>
-        <w:t>”</w:t>
-      </w:r>
-      <w:r>
-        <w:t xml:space="preserve">, </w:t>
-      </w:r>
-    </w:p>
-    <w:p>
-      <w:pPr>
-        <w:spacing w:line="360" w:lineRule="auto"/>
-        <w:rPr>
-          <w:lang w:val="en-US"/>
-        </w:rPr>
-      </w:pPr>
-      <w:r>
-        <w:t>В</w:t>
-      </w:r>
-      <w:r>
-        <w:t>ход</w:t>
-      </w:r>
-      <w:r>
-        <w:t>ы</w:t>
-      </w:r>
-      <w:r>
-        <w:t>:</w:t>
-      </w:r>
-      <w:r>
-        <w:t xml:space="preserve"> </w:t>
+        <w:t>Коррекция багов</w:t>
+      </w:r>
+      <w:r>
+        <w:t>”</w:t>
       </w:r>
     </w:p>
     <w:p>
@@ -2090,25 +2296,39 @@
         <w:t>“</w:t>
       </w:r>
       <w:r>
-        <w:t>Откорректированная запись</w:t>
-      </w:r>
-      <w:r>
-        <w:t>”</w:t>
-      </w:r>
-      <w:r>
-        <w:t xml:space="preserve"> с события </w:t>
-      </w:r>
-      <w:r>
-        <w:t>“</w:t>
-      </w:r>
-      <w:r>
-        <w:t>Корректировка записи</w:t>
-      </w:r>
-      <w:r>
-        <w:t>”</w:t>
-      </w:r>
-      <w:r>
-        <w:t>,</w:t>
+        <w:t>Опыт в создании модификаций в системе</w:t>
+      </w:r>
+      <w:r>
+        <w:t>”</w:t>
+      </w:r>
+      <w:r>
+        <w:t xml:space="preserve"> на событие </w:t>
+      </w:r>
+      <w:r>
+        <w:t>“</w:t>
+      </w:r>
+      <w:r>
+        <w:t>Модификация видеоигрового процесса</w:t>
+      </w:r>
+      <w:r>
+        <w:t>”</w:t>
+      </w:r>
+      <w:r>
+        <w:t xml:space="preserve"> </w:t>
+      </w:r>
+    </w:p>
+    <w:p>
+      <w:pPr>
+        <w:spacing w:line="360" w:lineRule="auto"/>
+      </w:pPr>
+      <w:r>
+        <w:t>Входы</w:t>
+      </w:r>
+      <w:r>
+        <w:t>:</w:t>
+      </w:r>
+      <w:r>
+        <w:t xml:space="preserve"> </w:t>
       </w:r>
     </w:p>
     <w:p>
@@ -2125,31 +2345,25 @@
         <w:t>“</w:t>
       </w:r>
       <w:r>
-        <w:t>Форма записи</w:t>
-      </w:r>
-      <w:r>
-        <w:t>”</w:t>
-      </w:r>
-      <w:r>
-        <w:t xml:space="preserve"> с хранилища данных </w:t>
-      </w:r>
-      <w:r>
-        <w:t>“1</w:t>
-      </w:r>
-      <w:r>
-        <w:t xml:space="preserve"> </w:t>
-      </w:r>
-      <w:r>
-        <w:t xml:space="preserve">| </w:t>
-      </w:r>
-      <w:r>
-        <w:t>Стандарт формы</w:t>
-      </w:r>
-      <w:r>
-        <w:t>”</w:t>
-      </w:r>
-      <w:r>
-        <w:t>,</w:t>
+        <w:t>Отчёт о прохождении тест. последовательности</w:t>
+      </w:r>
+      <w:r>
+        <w:t>”</w:t>
+      </w:r>
+      <w:r>
+        <w:t xml:space="preserve"> с события </w:t>
+      </w:r>
+      <w:r>
+        <w:t>“</w:t>
+      </w:r>
+      <w:r>
+        <w:t>Коррекция багов</w:t>
+      </w:r>
+      <w:r>
+        <w:t>”</w:t>
+      </w:r>
+      <w:r>
+        <w:t>.</w:t>
       </w:r>
     </w:p>
     <w:p>
@@ -2166,59 +2380,1366 @@
         <w:t>“</w:t>
       </w:r>
       <w:r>
-        <w:t>Доступные врачи</w:t>
-      </w:r>
-      <w:r>
-        <w:t>”</w:t>
-      </w:r>
-      <w:r>
-        <w:t xml:space="preserve"> с хранилища данных </w:t>
-      </w:r>
-      <w:r>
-        <w:t>“</w:t>
-      </w:r>
-      <w:r>
-        <w:t xml:space="preserve">2 </w:t>
-      </w:r>
-      <w:r>
-        <w:t xml:space="preserve">| </w:t>
-      </w:r>
-      <w:r>
-        <w:t>Состав больницы</w:t>
-      </w:r>
-      <w:r>
-        <w:t>”</w:t>
-      </w:r>
-      <w:r>
-        <w:t>.</w:t>
+        <w:t>Отчёт о применении модификаций</w:t>
+      </w:r>
+      <w:r>
+        <w:t>”</w:t>
+      </w:r>
+      <w:r>
+        <w:t xml:space="preserve"> с события </w:t>
+      </w:r>
+      <w:r>
+        <w:t>“</w:t>
+      </w:r>
+      <w:r>
+        <w:t>Модификация видеоигрового процесса</w:t>
+      </w:r>
+      <w:r>
+        <w:t>”</w:t>
+      </w:r>
+    </w:p>
+    <w:p>
+      <w:pPr>
+        <w:spacing w:after="160" w:line="278" w:lineRule="auto"/>
+        <w:ind w:firstLine="0"/>
+      </w:pPr>
+    </w:p>
+    <w:p>
+      <w:pPr>
+        <w:spacing w:after="160" w:line="278" w:lineRule="auto"/>
+      </w:pPr>
+      <w:r>
+        <w:t>2.</w:t>
+      </w:r>
+      <w:r>
+        <w:t>6</w:t>
+      </w:r>
+      <w:r>
+        <w:t xml:space="preserve"> – </w:t>
+      </w:r>
+      <w:r>
+        <w:t>Постро</w:t>
+      </w:r>
+      <w:r>
+        <w:t>ение</w:t>
+      </w:r>
+      <w:r>
+        <w:t xml:space="preserve"> DFD-диаграмм</w:t>
+      </w:r>
+      <w:r>
+        <w:t>ы</w:t>
+      </w:r>
+      <w:r>
+        <w:t xml:space="preserve"> главного (основного) процесса.</w:t>
+      </w:r>
+    </w:p>
+    <w:p>
+      <w:pPr>
+        <w:spacing w:after="160" w:line="278" w:lineRule="auto"/>
+        <w:ind w:firstLine="0"/>
+      </w:pPr>
+      <w:r>
+        <w:tab/>
+        <w:t xml:space="preserve">Исходя из данных, полученных в пунктах выше, был разработан главный процесс (Рисунок </w:t>
+      </w:r>
+      <w:r>
+        <w:t>Б.</w:t>
+      </w:r>
+      <w:r>
+        <w:t>1).</w:t>
+      </w:r>
+    </w:p>
+    <w:p>
+      <w:pPr>
+        <w:spacing w:after="160" w:line="278" w:lineRule="auto"/>
+      </w:pPr>
+      <w:r>
+        <w:lastRenderedPageBreak/>
+        <w:t>2.7 – Составление</w:t>
+      </w:r>
+      <w:r>
+        <w:t xml:space="preserve"> декомпозици</w:t>
+      </w:r>
+      <w:r>
+        <w:t>и</w:t>
+      </w:r>
+      <w:r>
+        <w:t xml:space="preserve"> (детализацию).</w:t>
+      </w:r>
+    </w:p>
+    <w:p>
+      <w:pPr>
+        <w:spacing w:after="160" w:line="278" w:lineRule="auto"/>
+      </w:pPr>
+      <w:r>
+        <w:t>Видеоигровая система направлена на отклик на действия игрока, модификацию разработчиком и прохождения тестов команды тестировщиков, следовательно, данную систему можно разбить на процессы</w:t>
+      </w:r>
+      <w:r>
+        <w:t>:</w:t>
+      </w:r>
+      <w:r>
+        <w:t xml:space="preserve"> </w:t>
+      </w:r>
+      <w:r>
+        <w:t>“</w:t>
+      </w:r>
+      <w:r>
+        <w:t>Взаимодействие с игрой</w:t>
+      </w:r>
+      <w:r>
+        <w:t>”</w:t>
+      </w:r>
+      <w:r>
+        <w:t xml:space="preserve">, </w:t>
+      </w:r>
+      <w:r>
+        <w:t>“</w:t>
+      </w:r>
+      <w:r>
+        <w:t>Тестирование видеоигры</w:t>
+      </w:r>
+      <w:r>
+        <w:t>”, “</w:t>
+      </w:r>
+      <w:r>
+        <w:t>Модификация видеоигрового процесса</w:t>
+      </w:r>
+      <w:r>
+        <w:t xml:space="preserve">”. </w:t>
+      </w:r>
+      <w:r>
+        <w:t xml:space="preserve">Помимо этих процессов, </w:t>
+      </w:r>
+      <w:r>
+        <w:t>“</w:t>
+      </w:r>
+      <w:r>
+        <w:t>Тести</w:t>
+      </w:r>
+      <w:r>
+        <w:t>рование видеоигры</w:t>
+      </w:r>
+      <w:r>
+        <w:t xml:space="preserve">” </w:t>
+      </w:r>
+      <w:r>
+        <w:t xml:space="preserve">может выявить баги, поэтому потребуется запустить процесс </w:t>
+      </w:r>
+      <w:r>
+        <w:t>“</w:t>
+      </w:r>
+      <w:r>
+        <w:t>Коррекция багов</w:t>
+      </w:r>
+      <w:r>
+        <w:t>”</w:t>
+      </w:r>
+      <w:r>
+        <w:t xml:space="preserve"> от внешней сущности </w:t>
+      </w:r>
+      <w:r>
+        <w:t>“</w:t>
+      </w:r>
+      <w:r>
+        <w:t>Команда разработчиков</w:t>
+      </w:r>
+      <w:r>
+        <w:t>”</w:t>
+      </w:r>
+      <w:r>
+        <w:t xml:space="preserve"> и </w:t>
+      </w:r>
+      <w:r>
+        <w:t>“</w:t>
+      </w:r>
+      <w:r>
+        <w:t>Создание тест. последовательности</w:t>
+      </w:r>
+      <w:r>
+        <w:t>”</w:t>
+      </w:r>
+      <w:r>
+        <w:t xml:space="preserve">, как процесс от внешней сущности </w:t>
+      </w:r>
+      <w:r>
+        <w:t>“</w:t>
+      </w:r>
+      <w:r>
+        <w:t>Команда тестировщиков</w:t>
+      </w:r>
+      <w:r>
+        <w:t>”</w:t>
+      </w:r>
+    </w:p>
+    <w:p>
+      <w:pPr>
+        <w:spacing w:after="160" w:line="278" w:lineRule="auto"/>
+      </w:pPr>
+      <w:r>
+        <w:t>2.8 – П</w:t>
+      </w:r>
+      <w:r>
+        <w:t>остро</w:t>
+      </w:r>
+      <w:r>
+        <w:t>ение</w:t>
+      </w:r>
+      <w:r>
+        <w:t xml:space="preserve"> таблиц</w:t>
+      </w:r>
+      <w:r>
+        <w:t>ы</w:t>
+      </w:r>
+      <w:r>
+        <w:t xml:space="preserve"> внутренних событий аналогично таблице 1.3</w:t>
+      </w:r>
+      <w:r>
+        <w:t xml:space="preserve"> д</w:t>
+      </w:r>
+      <w:r>
+        <w:t>ля каждого полученного подпроцесса.</w:t>
+      </w:r>
+    </w:p>
+    <w:p>
+      <w:pPr>
+        <w:spacing w:after="160" w:line="278" w:lineRule="auto"/>
+        <w:ind w:firstLine="0"/>
+      </w:pPr>
+    </w:p>
+    <w:p>
+      <w:pPr>
+        <w:spacing w:after="160" w:line="278" w:lineRule="auto"/>
+        <w:ind w:firstLine="0"/>
+      </w:pPr>
+      <w:r>
+        <w:t>Таблица 1 – Результаты выполнения п.2 и п.3.</w:t>
+      </w:r>
+    </w:p>
+    <w:tbl>
+      <w:tblPr>
+        <w:tblStyle w:val="af0"/>
+        <w:tblW w:w="9634" w:type="dxa"/>
+        <w:tblLook w:val="04A0" w:firstRow="1" w:lastRow="0" w:firstColumn="1" w:lastColumn="0" w:noHBand="0" w:noVBand="1"/>
+      </w:tblPr>
+      <w:tblGrid>
+        <w:gridCol w:w="426"/>
+        <w:gridCol w:w="1749"/>
+        <w:gridCol w:w="2271"/>
+        <w:gridCol w:w="1193"/>
+        <w:gridCol w:w="1749"/>
+        <w:gridCol w:w="2246"/>
+      </w:tblGrid>
+      <w:tr>
+        <w:tc>
+          <w:tcPr>
+            <w:tcW w:w="426" w:type="dxa"/>
+          </w:tcPr>
+          <w:p>
+            <w:pPr>
+              <w:spacing w:after="160" w:line="278" w:lineRule="auto"/>
+              <w:ind w:firstLine="0"/>
+              <w:jc w:val="center"/>
+              <w:rPr>
+                <w:sz w:val="22"/>
+                <w:szCs w:val="22"/>
+              </w:rPr>
+            </w:pPr>
+            <w:r>
+              <w:rPr>
+                <w:sz w:val="22"/>
+                <w:szCs w:val="22"/>
+              </w:rPr>
+              <w:t>№</w:t>
+            </w:r>
+          </w:p>
+        </w:tc>
+        <w:tc>
+          <w:tcPr>
+            <w:tcW w:w="1513" w:type="dxa"/>
+          </w:tcPr>
+          <w:p>
+            <w:pPr>
+              <w:spacing w:after="160" w:line="278" w:lineRule="auto"/>
+              <w:ind w:firstLine="0"/>
+              <w:jc w:val="center"/>
+              <w:rPr>
+                <w:sz w:val="22"/>
+                <w:szCs w:val="22"/>
+              </w:rPr>
+            </w:pPr>
+            <w:r>
+              <w:rPr>
+                <w:sz w:val="22"/>
+                <w:szCs w:val="22"/>
+              </w:rPr>
+              <w:t>Подпроцесс</w:t>
+            </w:r>
+          </w:p>
+        </w:tc>
+        <w:tc>
+          <w:tcPr>
+            <w:tcW w:w="2405" w:type="dxa"/>
+          </w:tcPr>
+          <w:p>
+            <w:pPr>
+              <w:spacing w:after="160" w:line="278" w:lineRule="auto"/>
+              <w:ind w:firstLine="0"/>
+              <w:jc w:val="center"/>
+              <w:rPr>
+                <w:sz w:val="22"/>
+                <w:szCs w:val="22"/>
+              </w:rPr>
+            </w:pPr>
+            <w:r>
+              <w:rPr>
+                <w:sz w:val="22"/>
+                <w:szCs w:val="22"/>
+              </w:rPr>
+              <w:t>Событие (описание взаимодействия)</w:t>
+            </w:r>
+          </w:p>
+        </w:tc>
+        <w:tc>
+          <w:tcPr>
+            <w:tcW w:w="1193" w:type="dxa"/>
+          </w:tcPr>
+          <w:p>
+            <w:pPr>
+              <w:spacing w:after="160" w:line="278" w:lineRule="auto"/>
+              <w:ind w:firstLine="0"/>
+              <w:jc w:val="center"/>
+              <w:rPr>
+                <w:sz w:val="22"/>
+                <w:szCs w:val="22"/>
+              </w:rPr>
+            </w:pPr>
+            <w:r>
+              <w:rPr>
+                <w:sz w:val="22"/>
+                <w:szCs w:val="22"/>
+              </w:rPr>
+              <w:t>Тип события</w:t>
+            </w:r>
+          </w:p>
+        </w:tc>
+        <w:tc>
+          <w:tcPr>
+            <w:tcW w:w="1451" w:type="dxa"/>
+          </w:tcPr>
+          <w:p>
+            <w:pPr>
+              <w:spacing w:after="160" w:line="278" w:lineRule="auto"/>
+              <w:ind w:firstLine="0"/>
+              <w:jc w:val="center"/>
+              <w:rPr>
+                <w:sz w:val="22"/>
+                <w:szCs w:val="22"/>
+              </w:rPr>
+            </w:pPr>
+            <w:r>
+              <w:rPr>
+                <w:sz w:val="22"/>
+                <w:szCs w:val="22"/>
+              </w:rPr>
+              <w:t>Основной процесс</w:t>
+            </w:r>
+          </w:p>
+        </w:tc>
+        <w:tc>
+          <w:tcPr>
+            <w:tcW w:w="2646" w:type="dxa"/>
+          </w:tcPr>
+          <w:p>
+            <w:pPr>
+              <w:spacing w:after="160" w:line="278" w:lineRule="auto"/>
+              <w:ind w:firstLine="0"/>
+              <w:jc w:val="center"/>
+              <w:rPr>
+                <w:sz w:val="22"/>
+                <w:szCs w:val="22"/>
+              </w:rPr>
+            </w:pPr>
+            <w:r>
+              <w:rPr>
+                <w:sz w:val="22"/>
+                <w:szCs w:val="22"/>
+              </w:rPr>
+              <w:t>Реакция системы</w:t>
+            </w:r>
+          </w:p>
+        </w:tc>
+      </w:tr>
+      <w:tr>
+        <w:trPr>
+          <w:trHeight w:val="270"/>
+        </w:trPr>
+        <w:tc>
+          <w:tcPr>
+            <w:tcW w:w="426" w:type="dxa"/>
+            <w:vMerge w:val="restart"/>
+            <w:vAlign w:val="center"/>
+          </w:tcPr>
+          <w:p>
+            <w:pPr>
+              <w:spacing w:after="160" w:line="278" w:lineRule="auto"/>
+              <w:ind w:firstLine="0"/>
+              <w:jc w:val="center"/>
+              <w:rPr>
+                <w:sz w:val="22"/>
+                <w:szCs w:val="22"/>
+              </w:rPr>
+            </w:pPr>
+            <w:r>
+              <w:rPr>
+                <w:sz w:val="22"/>
+                <w:szCs w:val="22"/>
+              </w:rPr>
+              <w:t>0</w:t>
+            </w:r>
+          </w:p>
+        </w:tc>
+        <w:tc>
+          <w:tcPr>
+            <w:tcW w:w="1513" w:type="dxa"/>
+            <w:vMerge w:val="restart"/>
+            <w:vAlign w:val="center"/>
+          </w:tcPr>
+          <w:p>
+            <w:pPr>
+              <w:spacing w:after="160" w:line="278" w:lineRule="auto"/>
+              <w:ind w:firstLine="0"/>
+              <w:jc w:val="center"/>
+              <w:rPr>
+                <w:sz w:val="22"/>
+                <w:szCs w:val="22"/>
+              </w:rPr>
+            </w:pPr>
+            <w:r>
+              <w:rPr>
+                <w:sz w:val="22"/>
+                <w:szCs w:val="22"/>
+              </w:rPr>
+              <w:t>Взаимодействие с игрой</w:t>
+            </w:r>
+          </w:p>
+        </w:tc>
+        <w:tc>
+          <w:tcPr>
+            <w:tcW w:w="2405" w:type="dxa"/>
+            <w:vAlign w:val="center"/>
+          </w:tcPr>
+          <w:p>
+            <w:pPr>
+              <w:spacing w:after="160" w:line="278" w:lineRule="auto"/>
+              <w:ind w:firstLine="0"/>
+              <w:jc w:val="center"/>
+              <w:rPr>
+                <w:sz w:val="22"/>
+                <w:szCs w:val="22"/>
+              </w:rPr>
+            </w:pPr>
+            <w:r>
+              <w:rPr>
+                <w:sz w:val="22"/>
+                <w:szCs w:val="22"/>
+              </w:rPr>
+              <w:t>Производит отслеживаемый системой ввод</w:t>
+            </w:r>
+          </w:p>
+        </w:tc>
+        <w:tc>
+          <w:tcPr>
+            <w:tcW w:w="1193" w:type="dxa"/>
+            <w:vAlign w:val="center"/>
+          </w:tcPr>
+          <w:p>
+            <w:pPr>
+              <w:spacing w:after="160" w:line="278" w:lineRule="auto"/>
+              <w:ind w:firstLine="0"/>
+              <w:jc w:val="center"/>
+              <w:rPr>
+                <w:sz w:val="22"/>
+                <w:szCs w:val="22"/>
+              </w:rPr>
+            </w:pPr>
+            <w:r>
+              <w:rPr>
+                <w:sz w:val="22"/>
+                <w:szCs w:val="22"/>
+              </w:rPr>
+              <w:t>Типичный</w:t>
+            </w:r>
+          </w:p>
+        </w:tc>
+        <w:tc>
+          <w:tcPr>
+            <w:tcW w:w="1451" w:type="dxa"/>
+            <w:vMerge w:val="restart"/>
+            <w:vAlign w:val="center"/>
+          </w:tcPr>
+          <w:p>
+            <w:pPr>
+              <w:spacing w:after="160" w:line="278" w:lineRule="auto"/>
+              <w:ind w:firstLine="0"/>
+              <w:jc w:val="center"/>
+              <w:rPr>
+                <w:sz w:val="22"/>
+                <w:szCs w:val="22"/>
+              </w:rPr>
+            </w:pPr>
+            <w:r>
+              <w:rPr>
+                <w:sz w:val="22"/>
+                <w:szCs w:val="22"/>
+              </w:rPr>
+              <w:t>Взаимодействие с игрой</w:t>
+            </w:r>
+          </w:p>
+        </w:tc>
+        <w:tc>
+          <w:tcPr>
+            <w:tcW w:w="2646" w:type="dxa"/>
+            <w:vAlign w:val="center"/>
+          </w:tcPr>
+          <w:p>
+            <w:pPr>
+              <w:spacing w:after="160" w:line="278" w:lineRule="auto"/>
+              <w:ind w:firstLine="0"/>
+              <w:jc w:val="center"/>
+              <w:rPr>
+                <w:sz w:val="22"/>
+                <w:szCs w:val="22"/>
+              </w:rPr>
+            </w:pPr>
+            <w:r>
+              <w:rPr>
+                <w:sz w:val="22"/>
+                <w:szCs w:val="22"/>
+              </w:rPr>
+              <w:t>Даёт отклик пользователю</w:t>
+            </w:r>
+          </w:p>
+        </w:tc>
+      </w:tr>
+      <w:tr>
+        <w:trPr>
+          <w:trHeight w:val="270"/>
+        </w:trPr>
+        <w:tc>
+          <w:tcPr>
+            <w:tcW w:w="426" w:type="dxa"/>
+            <w:vMerge/>
+            <w:vAlign w:val="center"/>
+          </w:tcPr>
+          <w:p>
+            <w:pPr>
+              <w:spacing w:after="160" w:line="278" w:lineRule="auto"/>
+              <w:ind w:firstLine="0"/>
+              <w:jc w:val="center"/>
+              <w:rPr>
+                <w:sz w:val="22"/>
+                <w:szCs w:val="22"/>
+              </w:rPr>
+            </w:pPr>
+          </w:p>
+        </w:tc>
+        <w:tc>
+          <w:tcPr>
+            <w:tcW w:w="1513" w:type="dxa"/>
+            <w:vMerge/>
+            <w:vAlign w:val="center"/>
+          </w:tcPr>
+          <w:p>
+            <w:pPr>
+              <w:spacing w:after="160" w:line="278" w:lineRule="auto"/>
+              <w:ind w:firstLine="0"/>
+              <w:jc w:val="center"/>
+              <w:rPr>
+                <w:sz w:val="22"/>
+                <w:szCs w:val="22"/>
+              </w:rPr>
+            </w:pPr>
+          </w:p>
+        </w:tc>
+        <w:tc>
+          <w:tcPr>
+            <w:tcW w:w="2405" w:type="dxa"/>
+            <w:vAlign w:val="center"/>
+          </w:tcPr>
+          <w:p>
+            <w:pPr>
+              <w:spacing w:after="160" w:line="278" w:lineRule="auto"/>
+              <w:ind w:firstLine="0"/>
+              <w:jc w:val="center"/>
+              <w:rPr>
+                <w:sz w:val="22"/>
+                <w:szCs w:val="22"/>
+              </w:rPr>
+            </w:pPr>
+            <w:r>
+              <w:rPr>
+                <w:sz w:val="22"/>
+                <w:szCs w:val="22"/>
+              </w:rPr>
+              <w:t xml:space="preserve">Производит </w:t>
+            </w:r>
+            <w:r>
+              <w:rPr>
+                <w:sz w:val="22"/>
+                <w:szCs w:val="22"/>
+              </w:rPr>
+              <w:t xml:space="preserve">не </w:t>
+            </w:r>
+            <w:r>
+              <w:rPr>
+                <w:sz w:val="22"/>
+                <w:szCs w:val="22"/>
+              </w:rPr>
+              <w:t>отслеживаемый системой ввод</w:t>
+            </w:r>
+          </w:p>
+        </w:tc>
+        <w:tc>
+          <w:tcPr>
+            <w:tcW w:w="1193" w:type="dxa"/>
+            <w:vAlign w:val="center"/>
+          </w:tcPr>
+          <w:p>
+            <w:pPr>
+              <w:spacing w:after="160" w:line="278" w:lineRule="auto"/>
+              <w:ind w:firstLine="0"/>
+              <w:jc w:val="center"/>
+              <w:rPr>
+                <w:sz w:val="22"/>
+                <w:szCs w:val="22"/>
+              </w:rPr>
+            </w:pPr>
+            <w:r>
+              <w:rPr>
+                <w:sz w:val="22"/>
+                <w:szCs w:val="22"/>
+              </w:rPr>
+              <w:t>Типичный</w:t>
+            </w:r>
+          </w:p>
+        </w:tc>
+        <w:tc>
+          <w:tcPr>
+            <w:tcW w:w="1451" w:type="dxa"/>
+            <w:vMerge/>
+            <w:vAlign w:val="center"/>
+          </w:tcPr>
+          <w:p>
+            <w:pPr>
+              <w:spacing w:after="160" w:line="278" w:lineRule="auto"/>
+              <w:ind w:firstLine="0"/>
+              <w:jc w:val="center"/>
+              <w:rPr>
+                <w:sz w:val="22"/>
+                <w:szCs w:val="22"/>
+              </w:rPr>
+            </w:pPr>
+          </w:p>
+        </w:tc>
+        <w:tc>
+          <w:tcPr>
+            <w:tcW w:w="2646" w:type="dxa"/>
+            <w:vAlign w:val="center"/>
+          </w:tcPr>
+          <w:p>
+            <w:pPr>
+              <w:spacing w:after="160" w:line="278" w:lineRule="auto"/>
+              <w:ind w:firstLine="0"/>
+              <w:jc w:val="center"/>
+              <w:rPr>
+                <w:sz w:val="22"/>
+                <w:szCs w:val="22"/>
+              </w:rPr>
+            </w:pPr>
+            <w:r>
+              <w:rPr>
+                <w:sz w:val="22"/>
+                <w:szCs w:val="22"/>
+              </w:rPr>
+              <w:t>Производит баг отчёт для разработчиков</w:t>
+            </w:r>
+          </w:p>
+        </w:tc>
+      </w:tr>
+      <w:tr>
+        <w:trPr>
+          <w:trHeight w:val="450"/>
+        </w:trPr>
+        <w:tc>
+          <w:tcPr>
+            <w:tcW w:w="426" w:type="dxa"/>
+            <w:vMerge w:val="restart"/>
+            <w:vAlign w:val="center"/>
+          </w:tcPr>
+          <w:p>
+            <w:pPr>
+              <w:spacing w:after="160" w:line="278" w:lineRule="auto"/>
+              <w:ind w:firstLine="0"/>
+              <w:jc w:val="center"/>
+              <w:rPr>
+                <w:sz w:val="22"/>
+                <w:szCs w:val="22"/>
+              </w:rPr>
+            </w:pPr>
+            <w:r>
+              <w:rPr>
+                <w:sz w:val="22"/>
+                <w:szCs w:val="22"/>
+              </w:rPr>
+              <w:t>1</w:t>
+            </w:r>
+          </w:p>
+        </w:tc>
+        <w:tc>
+          <w:tcPr>
+            <w:tcW w:w="1513" w:type="dxa"/>
+            <w:vMerge w:val="restart"/>
+            <w:vAlign w:val="center"/>
+          </w:tcPr>
+          <w:p>
+            <w:pPr>
+              <w:spacing w:after="160" w:line="278" w:lineRule="auto"/>
+              <w:ind w:firstLine="0"/>
+              <w:jc w:val="center"/>
+              <w:rPr>
+                <w:sz w:val="22"/>
+                <w:szCs w:val="22"/>
+              </w:rPr>
+            </w:pPr>
+            <w:r>
+              <w:rPr>
+                <w:sz w:val="22"/>
+                <w:szCs w:val="22"/>
+              </w:rPr>
+              <w:t>Тестирование</w:t>
+            </w:r>
+          </w:p>
+          <w:p>
+            <w:pPr>
+              <w:spacing w:after="160" w:line="278" w:lineRule="auto"/>
+              <w:ind w:firstLine="0"/>
+              <w:jc w:val="center"/>
+              <w:rPr>
+                <w:sz w:val="22"/>
+                <w:szCs w:val="22"/>
+              </w:rPr>
+            </w:pPr>
+            <w:r>
+              <w:rPr>
+                <w:sz w:val="22"/>
+                <w:szCs w:val="22"/>
+              </w:rPr>
+              <w:t>игры</w:t>
+            </w:r>
+          </w:p>
+        </w:tc>
+        <w:tc>
+          <w:tcPr>
+            <w:tcW w:w="2405" w:type="dxa"/>
+            <w:vAlign w:val="center"/>
+          </w:tcPr>
+          <w:p>
+            <w:pPr>
+              <w:spacing w:after="160" w:line="278" w:lineRule="auto"/>
+              <w:ind w:firstLine="0"/>
+              <w:jc w:val="center"/>
+              <w:rPr>
+                <w:sz w:val="22"/>
+                <w:szCs w:val="22"/>
+              </w:rPr>
+            </w:pPr>
+            <w:r>
+              <w:rPr>
+                <w:sz w:val="22"/>
+                <w:szCs w:val="22"/>
+              </w:rPr>
+              <w:t>Производит нетипичный ввод</w:t>
+            </w:r>
+          </w:p>
+        </w:tc>
+        <w:tc>
+          <w:tcPr>
+            <w:tcW w:w="1193" w:type="dxa"/>
+            <w:vAlign w:val="center"/>
+          </w:tcPr>
+          <w:p>
+            <w:pPr>
+              <w:spacing w:after="160" w:line="278" w:lineRule="auto"/>
+              <w:ind w:firstLine="0"/>
+              <w:jc w:val="center"/>
+              <w:rPr>
+                <w:sz w:val="22"/>
+                <w:szCs w:val="22"/>
+              </w:rPr>
+            </w:pPr>
+            <w:r>
+              <w:rPr>
+                <w:sz w:val="22"/>
+                <w:szCs w:val="22"/>
+              </w:rPr>
+              <w:t>Типичный</w:t>
+            </w:r>
+          </w:p>
+        </w:tc>
+        <w:tc>
+          <w:tcPr>
+            <w:tcW w:w="1451" w:type="dxa"/>
+            <w:vMerge w:val="restart"/>
+            <w:vAlign w:val="center"/>
+          </w:tcPr>
+          <w:p>
+            <w:pPr>
+              <w:spacing w:after="160" w:line="278" w:lineRule="auto"/>
+              <w:ind w:firstLine="0"/>
+              <w:jc w:val="center"/>
+              <w:rPr>
+                <w:sz w:val="22"/>
+                <w:szCs w:val="22"/>
+              </w:rPr>
+            </w:pPr>
+            <w:r>
+              <w:rPr>
+                <w:sz w:val="22"/>
+                <w:szCs w:val="22"/>
+              </w:rPr>
+              <w:t>Взаимодействие с игрой</w:t>
+            </w:r>
+          </w:p>
+        </w:tc>
+        <w:tc>
+          <w:tcPr>
+            <w:tcW w:w="2646" w:type="dxa"/>
+            <w:vAlign w:val="center"/>
+          </w:tcPr>
+          <w:p>
+            <w:pPr>
+              <w:spacing w:after="160" w:line="278" w:lineRule="auto"/>
+              <w:ind w:firstLine="0"/>
+              <w:jc w:val="center"/>
+              <w:rPr>
+                <w:sz w:val="22"/>
+                <w:szCs w:val="22"/>
+              </w:rPr>
+            </w:pPr>
+            <w:r>
+              <w:rPr>
+                <w:sz w:val="22"/>
+                <w:szCs w:val="22"/>
+              </w:rPr>
+              <w:t>Даёт сломанный отклик</w:t>
+            </w:r>
+          </w:p>
+        </w:tc>
+      </w:tr>
+      <w:tr>
+        <w:trPr>
+          <w:trHeight w:val="450"/>
+        </w:trPr>
+        <w:tc>
+          <w:tcPr>
+            <w:tcW w:w="426" w:type="dxa"/>
+            <w:vMerge/>
+            <w:vAlign w:val="center"/>
+          </w:tcPr>
+          <w:p>
+            <w:pPr>
+              <w:spacing w:after="160" w:line="278" w:lineRule="auto"/>
+              <w:ind w:firstLine="0"/>
+              <w:jc w:val="center"/>
+              <w:rPr>
+                <w:sz w:val="22"/>
+                <w:szCs w:val="22"/>
+              </w:rPr>
+            </w:pPr>
+          </w:p>
+        </w:tc>
+        <w:tc>
+          <w:tcPr>
+            <w:tcW w:w="1513" w:type="dxa"/>
+            <w:vMerge/>
+            <w:vAlign w:val="center"/>
+          </w:tcPr>
+          <w:p>
+            <w:pPr>
+              <w:spacing w:after="160" w:line="278" w:lineRule="auto"/>
+              <w:ind w:firstLine="0"/>
+              <w:jc w:val="center"/>
+              <w:rPr>
+                <w:sz w:val="22"/>
+                <w:szCs w:val="22"/>
+              </w:rPr>
+            </w:pPr>
+          </w:p>
+        </w:tc>
+        <w:tc>
+          <w:tcPr>
+            <w:tcW w:w="2405" w:type="dxa"/>
+            <w:vAlign w:val="center"/>
+          </w:tcPr>
+          <w:p>
+            <w:pPr>
+              <w:spacing w:after="160" w:line="278" w:lineRule="auto"/>
+              <w:ind w:firstLine="0"/>
+              <w:jc w:val="center"/>
+              <w:rPr>
+                <w:sz w:val="22"/>
+                <w:szCs w:val="22"/>
+              </w:rPr>
+            </w:pPr>
+            <w:r>
+              <w:rPr>
+                <w:sz w:val="22"/>
+                <w:szCs w:val="22"/>
+              </w:rPr>
+              <w:t>Производит тестирующую последовательность для корректного отклика</w:t>
+            </w:r>
+          </w:p>
+        </w:tc>
+        <w:tc>
+          <w:tcPr>
+            <w:tcW w:w="1193" w:type="dxa"/>
+            <w:vAlign w:val="center"/>
+          </w:tcPr>
+          <w:p>
+            <w:pPr>
+              <w:spacing w:after="160" w:line="278" w:lineRule="auto"/>
+              <w:ind w:firstLine="0"/>
+              <w:jc w:val="center"/>
+              <w:rPr>
+                <w:sz w:val="22"/>
+                <w:szCs w:val="22"/>
+              </w:rPr>
+            </w:pPr>
+            <w:r>
+              <w:rPr>
+                <w:sz w:val="22"/>
+                <w:szCs w:val="22"/>
+              </w:rPr>
+              <w:t>Типичный</w:t>
+            </w:r>
+          </w:p>
+        </w:tc>
+        <w:tc>
+          <w:tcPr>
+            <w:tcW w:w="1451" w:type="dxa"/>
+            <w:vMerge/>
+            <w:vAlign w:val="center"/>
+          </w:tcPr>
+          <w:p>
+            <w:pPr>
+              <w:spacing w:after="160" w:line="278" w:lineRule="auto"/>
+              <w:ind w:firstLine="0"/>
+              <w:jc w:val="center"/>
+              <w:rPr>
+                <w:sz w:val="22"/>
+                <w:szCs w:val="22"/>
+              </w:rPr>
+            </w:pPr>
+          </w:p>
+        </w:tc>
+        <w:tc>
+          <w:tcPr>
+            <w:tcW w:w="2646" w:type="dxa"/>
+            <w:vAlign w:val="center"/>
+          </w:tcPr>
+          <w:p>
+            <w:pPr>
+              <w:spacing w:after="160" w:line="278" w:lineRule="auto"/>
+              <w:ind w:firstLine="0"/>
+              <w:jc w:val="center"/>
+              <w:rPr>
+                <w:sz w:val="22"/>
+                <w:szCs w:val="22"/>
+              </w:rPr>
+            </w:pPr>
+            <w:r>
+              <w:rPr>
+                <w:sz w:val="22"/>
+                <w:szCs w:val="22"/>
+              </w:rPr>
+              <w:t>Проходит тесты</w:t>
+            </w:r>
+          </w:p>
+        </w:tc>
+      </w:tr>
+      <w:tr>
+        <w:trPr>
+          <w:trHeight w:val="1134"/>
+        </w:trPr>
+        <w:tc>
+          <w:tcPr>
+            <w:tcW w:w="426" w:type="dxa"/>
+            <w:vMerge w:val="restart"/>
+            <w:vAlign w:val="center"/>
+          </w:tcPr>
+          <w:p>
+            <w:pPr>
+              <w:spacing w:after="160" w:line="278" w:lineRule="auto"/>
+              <w:ind w:firstLine="0"/>
+              <w:jc w:val="center"/>
+              <w:rPr>
+                <w:sz w:val="22"/>
+                <w:szCs w:val="22"/>
+              </w:rPr>
+            </w:pPr>
+            <w:r>
+              <w:rPr>
+                <w:sz w:val="22"/>
+                <w:szCs w:val="22"/>
+              </w:rPr>
+              <w:t>2</w:t>
+            </w:r>
+          </w:p>
+        </w:tc>
+        <w:tc>
+          <w:tcPr>
+            <w:tcW w:w="1513" w:type="dxa"/>
+            <w:vMerge w:val="restart"/>
+            <w:vAlign w:val="center"/>
+          </w:tcPr>
+          <w:p>
+            <w:pPr>
+              <w:spacing w:after="160" w:line="278" w:lineRule="auto"/>
+              <w:ind w:firstLine="0"/>
+              <w:jc w:val="center"/>
+              <w:rPr>
+                <w:sz w:val="22"/>
+                <w:szCs w:val="22"/>
+              </w:rPr>
+            </w:pPr>
+            <w:r>
+              <w:rPr>
+                <w:sz w:val="22"/>
+                <w:szCs w:val="22"/>
+              </w:rPr>
+              <w:t>Модификация</w:t>
+            </w:r>
+          </w:p>
+          <w:p>
+            <w:pPr>
+              <w:spacing w:after="160" w:line="278" w:lineRule="auto"/>
+              <w:ind w:firstLine="0"/>
+              <w:jc w:val="center"/>
+              <w:rPr>
+                <w:sz w:val="22"/>
+                <w:szCs w:val="22"/>
+              </w:rPr>
+            </w:pPr>
+            <w:r>
+              <w:rPr>
+                <w:sz w:val="22"/>
+                <w:szCs w:val="22"/>
+              </w:rPr>
+              <w:t>процесса</w:t>
+            </w:r>
+          </w:p>
+        </w:tc>
+        <w:tc>
+          <w:tcPr>
+            <w:tcW w:w="2405" w:type="dxa"/>
+            <w:vAlign w:val="center"/>
+          </w:tcPr>
+          <w:p>
+            <w:pPr>
+              <w:spacing w:after="160" w:line="278" w:lineRule="auto"/>
+              <w:ind w:firstLine="0"/>
+              <w:jc w:val="center"/>
+              <w:rPr>
+                <w:sz w:val="22"/>
+                <w:szCs w:val="22"/>
+              </w:rPr>
+            </w:pPr>
+            <w:r>
+              <w:rPr>
+                <w:sz w:val="22"/>
+                <w:szCs w:val="22"/>
+              </w:rPr>
+              <w:t>Производится модификаци</w:t>
+            </w:r>
+            <w:r>
+              <w:rPr>
+                <w:sz w:val="22"/>
+                <w:szCs w:val="22"/>
+              </w:rPr>
+              <w:t>я</w:t>
+            </w:r>
+          </w:p>
+        </w:tc>
+        <w:tc>
+          <w:tcPr>
+            <w:tcW w:w="1193" w:type="dxa"/>
+            <w:vAlign w:val="center"/>
+          </w:tcPr>
+          <w:p>
+            <w:pPr>
+              <w:spacing w:after="160" w:line="278" w:lineRule="auto"/>
+              <w:ind w:firstLine="0"/>
+              <w:jc w:val="center"/>
+              <w:rPr>
+                <w:sz w:val="22"/>
+                <w:szCs w:val="22"/>
+              </w:rPr>
+            </w:pPr>
+            <w:r>
+              <w:rPr>
+                <w:sz w:val="22"/>
+                <w:szCs w:val="22"/>
+              </w:rPr>
+              <w:t>Типичный</w:t>
+            </w:r>
+          </w:p>
+        </w:tc>
+        <w:tc>
+          <w:tcPr>
+            <w:tcW w:w="1451" w:type="dxa"/>
+            <w:vMerge w:val="restart"/>
+            <w:vAlign w:val="center"/>
+          </w:tcPr>
+          <w:p>
+            <w:pPr>
+              <w:spacing w:after="160" w:line="278" w:lineRule="auto"/>
+              <w:ind w:firstLine="0"/>
+              <w:jc w:val="center"/>
+              <w:rPr>
+                <w:sz w:val="22"/>
+                <w:szCs w:val="22"/>
+              </w:rPr>
+            </w:pPr>
+            <w:r>
+              <w:rPr>
+                <w:sz w:val="22"/>
+                <w:szCs w:val="22"/>
+              </w:rPr>
+              <w:t>Взаимодействие с игрой</w:t>
+            </w:r>
+          </w:p>
+        </w:tc>
+        <w:tc>
+          <w:tcPr>
+            <w:tcW w:w="2646" w:type="dxa"/>
+            <w:vAlign w:val="center"/>
+          </w:tcPr>
+          <w:p>
+            <w:pPr>
+              <w:spacing w:after="160" w:line="278" w:lineRule="auto"/>
+              <w:ind w:firstLine="0"/>
+              <w:jc w:val="center"/>
+              <w:rPr>
+                <w:sz w:val="22"/>
+                <w:szCs w:val="22"/>
+              </w:rPr>
+            </w:pPr>
+            <w:r>
+              <w:rPr>
+                <w:sz w:val="22"/>
+                <w:szCs w:val="22"/>
+              </w:rPr>
+              <w:t>Добавление взаимодействий</w:t>
+            </w:r>
+          </w:p>
+        </w:tc>
+      </w:tr>
+      <w:tr>
+        <w:trPr>
+          <w:trHeight w:val="1134"/>
+        </w:trPr>
+        <w:tc>
+          <w:tcPr>
+            <w:tcW w:w="426" w:type="dxa"/>
+            <w:vMerge/>
+            <w:vAlign w:val="center"/>
+          </w:tcPr>
+          <w:p>
+            <w:pPr>
+              <w:spacing w:after="160" w:line="278" w:lineRule="auto"/>
+              <w:ind w:firstLine="0"/>
+              <w:jc w:val="center"/>
+              <w:rPr>
+                <w:sz w:val="22"/>
+                <w:szCs w:val="22"/>
+              </w:rPr>
+            </w:pPr>
+          </w:p>
+        </w:tc>
+        <w:tc>
+          <w:tcPr>
+            <w:tcW w:w="1513" w:type="dxa"/>
+            <w:vMerge/>
+            <w:vAlign w:val="center"/>
+          </w:tcPr>
+          <w:p>
+            <w:pPr>
+              <w:spacing w:after="160" w:line="278" w:lineRule="auto"/>
+              <w:ind w:firstLine="0"/>
+              <w:jc w:val="center"/>
+              <w:rPr>
+                <w:sz w:val="22"/>
+                <w:szCs w:val="22"/>
+              </w:rPr>
+            </w:pPr>
+          </w:p>
+        </w:tc>
+        <w:tc>
+          <w:tcPr>
+            <w:tcW w:w="2405" w:type="dxa"/>
+            <w:vAlign w:val="center"/>
+          </w:tcPr>
+          <w:p>
+            <w:pPr>
+              <w:spacing w:after="160" w:line="278" w:lineRule="auto"/>
+              <w:ind w:firstLine="0"/>
+              <w:jc w:val="center"/>
+              <w:rPr>
+                <w:sz w:val="22"/>
+                <w:szCs w:val="22"/>
+              </w:rPr>
+            </w:pPr>
+            <w:r>
+              <w:rPr>
+                <w:sz w:val="22"/>
+                <w:szCs w:val="22"/>
+              </w:rPr>
+              <w:t>Производит модификацию</w:t>
+            </w:r>
+          </w:p>
+        </w:tc>
+        <w:tc>
+          <w:tcPr>
+            <w:tcW w:w="1193" w:type="dxa"/>
+            <w:vAlign w:val="center"/>
+          </w:tcPr>
+          <w:p>
+            <w:pPr>
+              <w:spacing w:after="160" w:line="278" w:lineRule="auto"/>
+              <w:ind w:firstLine="0"/>
+              <w:jc w:val="center"/>
+              <w:rPr>
+                <w:sz w:val="22"/>
+                <w:szCs w:val="22"/>
+              </w:rPr>
+            </w:pPr>
+            <w:r>
+              <w:rPr>
+                <w:sz w:val="22"/>
+                <w:szCs w:val="22"/>
+              </w:rPr>
+              <w:t>Типичный</w:t>
+            </w:r>
+          </w:p>
+        </w:tc>
+        <w:tc>
+          <w:tcPr>
+            <w:tcW w:w="1451" w:type="dxa"/>
+            <w:vMerge/>
+            <w:vAlign w:val="center"/>
+          </w:tcPr>
+          <w:p>
+            <w:pPr>
+              <w:spacing w:after="160" w:line="278" w:lineRule="auto"/>
+              <w:ind w:firstLine="0"/>
+              <w:jc w:val="center"/>
+              <w:rPr>
+                <w:sz w:val="22"/>
+                <w:szCs w:val="22"/>
+              </w:rPr>
+            </w:pPr>
+          </w:p>
+        </w:tc>
+        <w:tc>
+          <w:tcPr>
+            <w:tcW w:w="2646" w:type="dxa"/>
+            <w:vAlign w:val="center"/>
+          </w:tcPr>
+          <w:p>
+            <w:pPr>
+              <w:spacing w:after="160" w:line="278" w:lineRule="auto"/>
+              <w:ind w:firstLine="0"/>
+              <w:jc w:val="center"/>
+              <w:rPr>
+                <w:sz w:val="22"/>
+                <w:szCs w:val="22"/>
+              </w:rPr>
+            </w:pPr>
+            <w:r>
+              <w:rPr>
+                <w:sz w:val="22"/>
+                <w:szCs w:val="22"/>
+              </w:rPr>
+              <w:t>Новые реакции на ранее нетипичные вводы</w:t>
+            </w:r>
+          </w:p>
+        </w:tc>
+      </w:tr>
+    </w:tbl>
+    <w:p>
+      <w:pPr>
+        <w:spacing w:after="160" w:line="278" w:lineRule="auto"/>
+        <w:ind w:firstLine="0"/>
+      </w:pPr>
+    </w:p>
+    <w:p>
+      <w:pPr>
+        <w:spacing w:after="160" w:line="278" w:lineRule="auto"/>
+      </w:pPr>
+      <w:r>
+        <w:lastRenderedPageBreak/>
+        <w:t xml:space="preserve">2.8 – </w:t>
+      </w:r>
+      <w:r>
+        <w:t>Выдел</w:t>
+      </w:r>
+      <w:r>
+        <w:t>ение</w:t>
+      </w:r>
+      <w:r>
+        <w:t xml:space="preserve"> поток</w:t>
+      </w:r>
+      <w:r>
+        <w:t>ов</w:t>
+      </w:r>
+      <w:r>
+        <w:t xml:space="preserve"> данных, которыми обмениваются процессы и внешние сущности, выдел</w:t>
+      </w:r>
+      <w:r>
+        <w:t>ение</w:t>
+      </w:r>
+      <w:r>
+        <w:t xml:space="preserve"> поставщиков и потребителей информации</w:t>
+      </w:r>
+      <w:r>
+        <w:t xml:space="preserve"> </w:t>
+      </w:r>
+      <w:r>
+        <w:t>для каждого из внутренних процессов.</w:t>
       </w:r>
     </w:p>
     <w:p>
       <w:pPr>
         <w:spacing w:line="360" w:lineRule="auto"/>
-        <w:ind w:firstLine="0"/>
       </w:pPr>
     </w:p>
     <w:p>
       <w:pPr>
         <w:spacing w:line="360" w:lineRule="auto"/>
-        <w:rPr>
-          <w:lang w:val="en-US"/>
-        </w:rPr>
-      </w:pPr>
-      <w:r>
-        <w:t xml:space="preserve">Событие </w:t>
-      </w:r>
-      <w:r>
-        <w:t>“</w:t>
-      </w:r>
-      <w:r>
-        <w:t>Корректировка записи</w:t>
-      </w:r>
-      <w:r>
-        <w:rPr>
-          <w:lang w:val="en-US"/>
-        </w:rPr>
+      </w:pPr>
+      <w:r>
+        <w:t>Событие</w:t>
+      </w:r>
+      <w:r>
+        <w:t xml:space="preserve"> </w:t>
+      </w:r>
+      <w:r>
+        <w:t>“</w:t>
+      </w:r>
+      <w:r>
+        <w:t>Взаимодействие с игрой</w:t>
+      </w:r>
+      <w:r>
         <w:t xml:space="preserve">”: </w:t>
       </w:r>
     </w:p>
@@ -2250,31 +3771,19 @@
         <w:t>“</w:t>
       </w:r>
       <w:r>
-        <w:t>Откорректированная запись</w:t>
-      </w:r>
-      <w:r>
-        <w:t>”</w:t>
-      </w:r>
-      <w:r>
-        <w:t xml:space="preserve"> </w:t>
-      </w:r>
-      <w:r>
-        <w:t>на</w:t>
-      </w:r>
-      <w:r>
-        <w:t xml:space="preserve"> событи</w:t>
-      </w:r>
-      <w:r>
-        <w:t>е</w:t>
-      </w:r>
-      <w:r>
-        <w:t xml:space="preserve"> </w:t>
-      </w:r>
-      <w:r>
-        <w:t>“</w:t>
-      </w:r>
-      <w:r>
-        <w:t>Запись на приём</w:t>
+        <w:t>Положительный отклик</w:t>
+      </w:r>
+      <w:r>
+        <w:t>”</w:t>
+      </w:r>
+      <w:r>
+        <w:t xml:space="preserve"> на внешнюю сущность </w:t>
+      </w:r>
+      <w:r>
+        <w:t>“</w:t>
+      </w:r>
+      <w:r>
+        <w:t>Игрок</w:t>
       </w:r>
       <w:r>
         <w:t>”</w:t>
@@ -2297,22 +3806,34 @@
         <w:t>“</w:t>
       </w:r>
       <w:r>
-        <w:t>Неоткорректированная запись</w:t>
-      </w:r>
-      <w:r>
-        <w:t>”</w:t>
-      </w:r>
-      <w:r>
-        <w:t xml:space="preserve"> на событие </w:t>
-      </w:r>
-      <w:r>
-        <w:t>“</w:t>
-      </w:r>
-      <w:r>
-        <w:t>Обработки заявки на запись</w:t>
-      </w:r>
-      <w:r>
-        <w:t>”</w:t>
+        <w:t>Отчёт о негативных откликах</w:t>
+      </w:r>
+      <w:r>
+        <w:t>”</w:t>
+      </w:r>
+      <w:r>
+        <w:t xml:space="preserve"> </w:t>
+      </w:r>
+      <w:r>
+        <w:t xml:space="preserve">на хранилище данных </w:t>
+      </w:r>
+      <w:r>
+        <w:t>“</w:t>
+      </w:r>
+      <w:r>
+        <w:t>3</w:t>
+      </w:r>
+      <w:r>
+        <w:t xml:space="preserve"> | </w:t>
+      </w:r>
+      <w:r>
+        <w:t>Известные баги</w:t>
+      </w:r>
+      <w:r>
+        <w:t>”</w:t>
+      </w:r>
+      <w:r>
+        <w:t>,</w:t>
       </w:r>
     </w:p>
     <w:p>
@@ -2346,25 +3867,31 @@
         <w:t>“</w:t>
       </w:r>
       <w:r>
-        <w:t>Правки записи</w:t>
-      </w:r>
-      <w:r>
-        <w:t>”</w:t>
-      </w:r>
-      <w:r>
-        <w:t xml:space="preserve"> с события </w:t>
-      </w:r>
-      <w:r>
-        <w:t>“</w:t>
-      </w:r>
-      <w:r>
-        <w:t>Обработки заявки на запись</w:t>
-      </w:r>
-      <w:r>
-        <w:t>”</w:t>
-      </w:r>
-      <w:r>
-        <w:t xml:space="preserve">, </w:t>
+        <w:t>Ввод с клавиатуры</w:t>
+      </w:r>
+      <w:r>
+        <w:t>/</w:t>
+      </w:r>
+      <w:r>
+        <w:t>мыши</w:t>
+      </w:r>
+      <w:r>
+        <w:t>”</w:t>
+      </w:r>
+      <w:r>
+        <w:t xml:space="preserve"> с внешней сущности </w:t>
+      </w:r>
+      <w:r>
+        <w:t>“</w:t>
+      </w:r>
+      <w:r>
+        <w:t>Игрок</w:t>
+      </w:r>
+      <w:r>
+        <w:t>”</w:t>
+      </w:r>
+      <w:r>
+        <w:t>,</w:t>
       </w:r>
     </w:p>
     <w:p>
@@ -2381,32 +3908,45 @@
         <w:t>“</w:t>
       </w:r>
       <w:r>
-        <w:t>Заявка на запись</w:t>
-      </w:r>
-      <w:r>
-        <w:t>”</w:t>
-      </w:r>
-      <w:r>
-        <w:t xml:space="preserve"> с события </w:t>
-      </w:r>
-      <w:r>
-        <w:t>“</w:t>
-      </w:r>
-      <w:r>
-        <w:t>Запись на приём</w:t>
-      </w:r>
-      <w:r>
-        <w:t>”</w:t>
-      </w:r>
-    </w:p>
-    <w:p>
-      <w:pPr>
-        <w:spacing w:after="160" w:line="278" w:lineRule="auto"/>
-      </w:pPr>
+        <w:t>Допустимый ввод</w:t>
+      </w:r>
+      <w:r>
+        <w:t>”</w:t>
+      </w:r>
+      <w:r>
+        <w:t xml:space="preserve"> с хранилища данных </w:t>
+      </w:r>
+      <w:r>
+        <w:t>“1</w:t>
+      </w:r>
+      <w:r>
+        <w:t xml:space="preserve"> </w:t>
+      </w:r>
+      <w:r>
+        <w:t xml:space="preserve">| </w:t>
+      </w:r>
+      <w:r>
+        <w:t>Отслеживаемый ввод</w:t>
+      </w:r>
+      <w:r>
+        <w:t>”</w:t>
+      </w:r>
+      <w:r>
+        <w:t>.</w:t>
+      </w:r>
     </w:p>
     <w:p>
       <w:pPr>
         <w:spacing w:line="360" w:lineRule="auto"/>
+        <w:ind w:firstLine="0"/>
+      </w:pPr>
+    </w:p>
+    <w:p>
+      <w:pPr>
+        <w:spacing w:line="360" w:lineRule="auto"/>
+        <w:rPr>
+          <w:lang w:val="en-US"/>
+        </w:rPr>
       </w:pPr>
       <w:r>
         <w:t xml:space="preserve">Событие </w:t>
@@ -2415,9 +3955,12 @@
         <w:t>“</w:t>
       </w:r>
       <w:r>
-        <w:t>Обработка заявки на запись</w:t>
-      </w:r>
-      <w:r>
+        <w:t>Тестирование видеоигры</w:t>
+      </w:r>
+      <w:r>
+        <w:rPr>
+          <w:lang w:val="en-US"/>
+        </w:rPr>
         <w:t xml:space="preserve">”: </w:t>
       </w:r>
     </w:p>
@@ -2449,42 +3992,25 @@
         <w:t>“</w:t>
       </w:r>
       <w:r>
-        <w:t>Правки записи</w:t>
-      </w:r>
-      <w:r>
-        <w:t>”</w:t>
-      </w:r>
-      <w:r>
-        <w:t xml:space="preserve"> на событие </w:t>
-      </w:r>
-      <w:r>
-        <w:t>“</w:t>
-      </w:r>
-      <w:r>
-        <w:t>Корректировка записи</w:t>
+        <w:t>Отредактированное по</w:t>
+      </w:r>
+      <w:r>
+        <w:t>”</w:t>
+      </w:r>
+      <w:r>
+        <w:t xml:space="preserve"> на внешнюю сущность </w:t>
+      </w:r>
+      <w:r>
+        <w:t>“</w:t>
+      </w:r>
+      <w:r>
+        <w:t>Команда тестировки</w:t>
       </w:r>
       <w:r>
         <w:t>”</w:t>
       </w:r>
       <w:r>
         <w:t>,</w:t>
-      </w:r>
-    </w:p>
-    <w:p>
-      <w:pPr>
-        <w:spacing w:line="360" w:lineRule="auto"/>
-        <w:rPr>
-          <w:lang w:val="en-US"/>
-        </w:rPr>
-      </w:pPr>
-      <w:r>
-        <w:t>Входы</w:t>
-      </w:r>
-      <w:r>
-        <w:t>:</w:t>
-      </w:r>
-      <w:r>
-        <w:t xml:space="preserve"> </w:t>
       </w:r>
     </w:p>
     <w:p>
@@ -2498,29 +4024,42 @@
         <w:ind w:left="0" w:firstLine="709"/>
       </w:pPr>
       <w:r>
-        <w:lastRenderedPageBreak/>
-        <w:t>“</w:t>
-      </w:r>
-      <w:r>
-        <w:t>Неоткорректированная запись</w:t>
-      </w:r>
-      <w:r>
-        <w:t>”</w:t>
-      </w:r>
-      <w:r>
-        <w:t xml:space="preserve"> с события </w:t>
-      </w:r>
-      <w:r>
-        <w:t>“</w:t>
-      </w:r>
-      <w:r>
-        <w:t>Корректировка записи</w:t>
-      </w:r>
-      <w:r>
-        <w:t>”</w:t>
-      </w:r>
-      <w:r>
-        <w:t xml:space="preserve">, </w:t>
+        <w:t>“</w:t>
+      </w:r>
+      <w:r>
+        <w:t>Список багов</w:t>
+      </w:r>
+      <w:r>
+        <w:t>”</w:t>
+      </w:r>
+      <w:r>
+        <w:t xml:space="preserve"> на событие </w:t>
+      </w:r>
+      <w:r>
+        <w:t>“</w:t>
+      </w:r>
+      <w:r>
+        <w:t>Коррекция багов</w:t>
+      </w:r>
+      <w:r>
+        <w:t>”</w:t>
+      </w:r>
+    </w:p>
+    <w:p>
+      <w:pPr>
+        <w:spacing w:line="360" w:lineRule="auto"/>
+        <w:rPr>
+          <w:lang w:val="en-US"/>
+        </w:rPr>
+      </w:pPr>
+      <w:r>
+        <w:t>Входы</w:t>
+      </w:r>
+      <w:r>
+        <w:t>:</w:t>
+      </w:r>
+      <w:r>
+        <w:t xml:space="preserve"> </w:t>
       </w:r>
     </w:p>
     <w:p>
@@ -2537,28 +4076,25 @@
         <w:t>“</w:t>
       </w:r>
       <w:r>
-        <w:t>Корректировки</w:t>
-      </w:r>
-      <w:r>
-        <w:t>”</w:t>
-      </w:r>
-      <w:r>
-        <w:t xml:space="preserve"> с </w:t>
-      </w:r>
-      <w:r>
-        <w:t>внешней сущности</w:t>
-      </w:r>
-      <w:r>
-        <w:t xml:space="preserve"> </w:t>
-      </w:r>
-      <w:r>
-        <w:t>“</w:t>
-      </w:r>
-      <w:r>
-        <w:t>Мед. регистратор</w:t>
-      </w:r>
-      <w:r>
-        <w:t>”</w:t>
+        <w:t>Опыт тестирования</w:t>
+      </w:r>
+      <w:r>
+        <w:t>”</w:t>
+      </w:r>
+      <w:r>
+        <w:t xml:space="preserve"> с внешней сущности </w:t>
+      </w:r>
+      <w:r>
+        <w:t>“</w:t>
+      </w:r>
+      <w:r>
+        <w:t>Команда тестировки</w:t>
+      </w:r>
+      <w:r>
+        <w:t>”</w:t>
+      </w:r>
+      <w:r>
+        <w:t xml:space="preserve">, </w:t>
       </w:r>
     </w:p>
     <w:p>
@@ -2575,7 +4111,42 @@
         <w:t>“</w:t>
       </w:r>
       <w:r>
-        <w:t>Доступные врачи</w:t>
+        <w:t>Имеющиеся тесты</w:t>
+      </w:r>
+      <w:r>
+        <w:t>”</w:t>
+      </w:r>
+      <w:r>
+        <w:t xml:space="preserve"> с </w:t>
+      </w:r>
+      <w:r>
+        <w:rPr>
+          <w:lang w:val="en-US"/>
+        </w:rPr>
+        <w:t xml:space="preserve">“2 | </w:t>
+      </w:r>
+      <w:r>
+        <w:t>Тесты</w:t>
+      </w:r>
+      <w:r>
+        <w:t>”</w:t>
+      </w:r>
+    </w:p>
+    <w:p>
+      <w:pPr>
+        <w:pStyle w:val="ab"/>
+        <w:numPr>
+          <w:ilvl w:val="0"/>
+          <w:numId w:val="2"/>
+        </w:numPr>
+        <w:spacing w:line="360" w:lineRule="auto"/>
+        <w:ind w:left="0" w:firstLine="709"/>
+      </w:pPr>
+      <w:r>
+        <w:t>“</w:t>
+      </w:r>
+      <w:r>
+        <w:t>Непроверенные баги</w:t>
       </w:r>
       <w:r>
         <w:t>”</w:t>
@@ -2584,6 +4155,232 @@
         <w:t xml:space="preserve"> с хранилища данных </w:t>
       </w:r>
       <w:r>
+        <w:t xml:space="preserve">“3 | </w:t>
+      </w:r>
+      <w:r>
+        <w:t>Известные баги</w:t>
+      </w:r>
+      <w:r>
+        <w:t>”</w:t>
+      </w:r>
+    </w:p>
+    <w:p>
+      <w:pPr>
+        <w:spacing w:after="160" w:line="278" w:lineRule="auto"/>
+      </w:pPr>
+    </w:p>
+    <w:p>
+      <w:pPr>
+        <w:spacing w:line="360" w:lineRule="auto"/>
+      </w:pPr>
+      <w:r>
+        <w:t xml:space="preserve">Событие </w:t>
+      </w:r>
+      <w:r>
+        <w:t>“</w:t>
+      </w:r>
+      <w:r>
+        <w:t>Создание тест. последовательности</w:t>
+      </w:r>
+      <w:r>
+        <w:t xml:space="preserve">”: </w:t>
+      </w:r>
+    </w:p>
+    <w:p>
+      <w:pPr>
+        <w:spacing w:line="360" w:lineRule="auto"/>
+      </w:pPr>
+      <w:r>
+        <w:t>Выходы</w:t>
+      </w:r>
+      <w:r>
+        <w:t>:</w:t>
+      </w:r>
+      <w:r>
+        <w:t xml:space="preserve"> </w:t>
+      </w:r>
+    </w:p>
+    <w:p>
+      <w:pPr>
+        <w:pStyle w:val="ab"/>
+        <w:numPr>
+          <w:ilvl w:val="0"/>
+          <w:numId w:val="2"/>
+        </w:numPr>
+        <w:spacing w:line="360" w:lineRule="auto"/>
+        <w:ind w:left="0" w:firstLine="709"/>
+      </w:pPr>
+      <w:r>
+        <w:t>“</w:t>
+      </w:r>
+      <w:r>
+        <w:t>Новые тест. последовательности</w:t>
+      </w:r>
+      <w:r>
+        <w:t>”</w:t>
+      </w:r>
+      <w:r>
+        <w:t xml:space="preserve"> на хранилище </w:t>
+      </w:r>
+      <w:r>
+        <w:t>“</w:t>
+      </w:r>
+      <w:r>
+        <w:t>2</w:t>
+      </w:r>
+      <w:r>
+        <w:t xml:space="preserve"> | </w:t>
+      </w:r>
+      <w:r>
+        <w:t>Тесты</w:t>
+      </w:r>
+      <w:r>
+        <w:t>”</w:t>
+      </w:r>
+      <w:r>
+        <w:t>,</w:t>
+      </w:r>
+    </w:p>
+    <w:p>
+      <w:pPr>
+        <w:pStyle w:val="ab"/>
+        <w:numPr>
+          <w:ilvl w:val="0"/>
+          <w:numId w:val="2"/>
+        </w:numPr>
+        <w:spacing w:line="360" w:lineRule="auto"/>
+        <w:ind w:left="0" w:firstLine="709"/>
+      </w:pPr>
+      <w:r>
+        <w:t>“</w:t>
+      </w:r>
+      <w:r>
+        <w:t>Отчёт о прохождении тестов</w:t>
+      </w:r>
+      <w:r>
+        <w:t>”</w:t>
+      </w:r>
+      <w:r>
+        <w:t xml:space="preserve"> на внешнюю сущность </w:t>
+      </w:r>
+      <w:r>
+        <w:t>“</w:t>
+      </w:r>
+      <w:r>
+        <w:t>Команда тестировки</w:t>
+      </w:r>
+      <w:r>
+        <w:t>”</w:t>
+      </w:r>
+    </w:p>
+    <w:p>
+      <w:pPr>
+        <w:spacing w:line="360" w:lineRule="auto"/>
+        <w:rPr>
+          <w:lang w:val="en-US"/>
+        </w:rPr>
+      </w:pPr>
+      <w:r>
+        <w:t>Входы</w:t>
+      </w:r>
+      <w:r>
+        <w:t>:</w:t>
+      </w:r>
+      <w:r>
+        <w:t xml:space="preserve"> </w:t>
+      </w:r>
+    </w:p>
+    <w:p>
+      <w:pPr>
+        <w:pStyle w:val="ab"/>
+        <w:numPr>
+          <w:ilvl w:val="0"/>
+          <w:numId w:val="2"/>
+        </w:numPr>
+        <w:spacing w:line="360" w:lineRule="auto"/>
+        <w:ind w:left="0" w:firstLine="709"/>
+      </w:pPr>
+      <w:r>
+        <w:lastRenderedPageBreak/>
+        <w:t>“</w:t>
+      </w:r>
+      <w:r>
+        <w:t>Представление функциональности ПО</w:t>
+      </w:r>
+      <w:r>
+        <w:t>”</w:t>
+      </w:r>
+      <w:r>
+        <w:t xml:space="preserve"> с внешней сущности </w:t>
+      </w:r>
+      <w:r>
+        <w:t>“</w:t>
+      </w:r>
+      <w:r>
+        <w:t>Команда тестировки</w:t>
+      </w:r>
+      <w:r>
+        <w:t>”</w:t>
+      </w:r>
+      <w:r>
+        <w:t xml:space="preserve">, </w:t>
+      </w:r>
+    </w:p>
+    <w:p>
+      <w:pPr>
+        <w:pStyle w:val="ab"/>
+        <w:numPr>
+          <w:ilvl w:val="0"/>
+          <w:numId w:val="2"/>
+        </w:numPr>
+        <w:spacing w:line="360" w:lineRule="auto"/>
+        <w:ind w:left="0" w:firstLine="709"/>
+      </w:pPr>
+      <w:r>
+        <w:t>“</w:t>
+      </w:r>
+      <w:r>
+        <w:t>Отчёт об изменениях</w:t>
+      </w:r>
+      <w:r>
+        <w:t>”</w:t>
+      </w:r>
+      <w:r>
+        <w:t xml:space="preserve"> с события </w:t>
+      </w:r>
+      <w:r>
+        <w:t>“</w:t>
+      </w:r>
+      <w:r>
+        <w:t>Коррекция багов</w:t>
+      </w:r>
+      <w:r>
+        <w:t>”</w:t>
+      </w:r>
+    </w:p>
+    <w:p>
+      <w:pPr>
+        <w:pStyle w:val="ab"/>
+        <w:numPr>
+          <w:ilvl w:val="0"/>
+          <w:numId w:val="2"/>
+        </w:numPr>
+        <w:spacing w:line="360" w:lineRule="auto"/>
+        <w:ind w:left="0" w:firstLine="709"/>
+      </w:pPr>
+      <w:r>
+        <w:t>“</w:t>
+      </w:r>
+      <w:r>
+        <w:t>Имеющиеся тесты</w:t>
+      </w:r>
+      <w:r>
+        <w:t>”</w:t>
+      </w:r>
+      <w:r>
+        <w:t xml:space="preserve"> с хранилища данных </w:t>
+      </w:r>
+      <w:r>
         <w:t>“</w:t>
       </w:r>
       <w:r>
@@ -2593,7 +4390,7 @@
         <w:t xml:space="preserve">| </w:t>
       </w:r>
       <w:r>
-        <w:t>Состав больницы</w:t>
+        <w:t>Тесты</w:t>
       </w:r>
       <w:r>
         <w:t>”</w:t>
@@ -2609,188 +4406,514 @@
     </w:p>
     <w:p>
       <w:pPr>
+        <w:spacing w:line="360" w:lineRule="auto"/>
+      </w:pPr>
+      <w:r>
+        <w:t xml:space="preserve">Событие </w:t>
+      </w:r>
+      <w:r>
+        <w:t>“</w:t>
+      </w:r>
+      <w:r>
+        <w:t>Коррекция багов</w:t>
+      </w:r>
+      <w:r>
+        <w:t xml:space="preserve">”: </w:t>
+      </w:r>
+    </w:p>
+    <w:p>
+      <w:pPr>
+        <w:spacing w:line="360" w:lineRule="auto"/>
+      </w:pPr>
+      <w:r>
+        <w:t>Выходы</w:t>
+      </w:r>
+      <w:r>
+        <w:t>:</w:t>
+      </w:r>
+      <w:r>
+        <w:t xml:space="preserve"> </w:t>
+      </w:r>
+    </w:p>
+    <w:p>
+      <w:pPr>
+        <w:pStyle w:val="ab"/>
+        <w:numPr>
+          <w:ilvl w:val="0"/>
+          <w:numId w:val="2"/>
+        </w:numPr>
+        <w:spacing w:line="360" w:lineRule="auto"/>
+        <w:ind w:left="0" w:firstLine="709"/>
+      </w:pPr>
+      <w:r>
+        <w:t>“</w:t>
+      </w:r>
+      <w:r>
+        <w:t>Отчёт об изменениях</w:t>
+      </w:r>
+      <w:r>
+        <w:t>”</w:t>
+      </w:r>
+      <w:r>
+        <w:t xml:space="preserve"> на событие </w:t>
+      </w:r>
+      <w:r>
+        <w:t>“</w:t>
+      </w:r>
+      <w:r>
+        <w:t>Создание тест. последовательности</w:t>
+      </w:r>
+      <w:r>
+        <w:t>”</w:t>
+      </w:r>
+      <w:r>
+        <w:t>,</w:t>
+      </w:r>
+    </w:p>
+    <w:p>
+      <w:pPr>
+        <w:pStyle w:val="ab"/>
+        <w:numPr>
+          <w:ilvl w:val="0"/>
+          <w:numId w:val="2"/>
+        </w:numPr>
+        <w:spacing w:line="360" w:lineRule="auto"/>
+        <w:ind w:left="0" w:firstLine="709"/>
+      </w:pPr>
+      <w:r>
+        <w:t>“</w:t>
+      </w:r>
+      <w:r>
+        <w:t>Отчёт о прохождении тест. последовательности</w:t>
+      </w:r>
+      <w:r>
+        <w:t>”</w:t>
+      </w:r>
+      <w:r>
+        <w:t xml:space="preserve"> на внешнюю сущность </w:t>
+      </w:r>
+      <w:r>
+        <w:rPr>
+          <w:lang w:val="en-US"/>
+        </w:rPr>
+        <w:t>“</w:t>
+      </w:r>
+      <w:r>
+        <w:t>Команда разработки</w:t>
+      </w:r>
+      <w:r>
+        <w:rPr>
+          <w:lang w:val="en-US"/>
+        </w:rPr>
+        <w:t>”</w:t>
+      </w:r>
+    </w:p>
+    <w:p>
+      <w:pPr>
+        <w:spacing w:line="360" w:lineRule="auto"/>
+        <w:rPr>
+          <w:lang w:val="en-US"/>
+        </w:rPr>
+      </w:pPr>
+      <w:r>
+        <w:t>Входы</w:t>
+      </w:r>
+      <w:r>
+        <w:t>:</w:t>
+      </w:r>
+      <w:r>
+        <w:t xml:space="preserve"> </w:t>
+      </w:r>
+    </w:p>
+    <w:p>
+      <w:pPr>
+        <w:pStyle w:val="ab"/>
+        <w:numPr>
+          <w:ilvl w:val="0"/>
+          <w:numId w:val="2"/>
+        </w:numPr>
+        <w:spacing w:line="360" w:lineRule="auto"/>
+        <w:ind w:left="0" w:firstLine="709"/>
+      </w:pPr>
+      <w:r>
+        <w:t>“</w:t>
+      </w:r>
+      <w:r>
+        <w:t>Опыт в коррекции ПО</w:t>
+      </w:r>
+      <w:r>
+        <w:t>”</w:t>
+      </w:r>
+      <w:r>
+        <w:t xml:space="preserve"> с внешней сущности </w:t>
+      </w:r>
+      <w:r>
+        <w:t>“</w:t>
+      </w:r>
+      <w:r>
+        <w:t>Команда разработки</w:t>
+      </w:r>
+      <w:r>
+        <w:t>”</w:t>
+      </w:r>
+      <w:r>
+        <w:t xml:space="preserve">, </w:t>
+      </w:r>
+    </w:p>
+    <w:p>
+      <w:pPr>
+        <w:pStyle w:val="ab"/>
+        <w:numPr>
+          <w:ilvl w:val="0"/>
+          <w:numId w:val="2"/>
+        </w:numPr>
+        <w:spacing w:line="360" w:lineRule="auto"/>
+        <w:ind w:left="0" w:firstLine="709"/>
+      </w:pPr>
+      <w:r>
+        <w:t>“</w:t>
+      </w:r>
+      <w:r>
+        <w:t>Список багов</w:t>
+      </w:r>
+      <w:r>
+        <w:t>”</w:t>
+      </w:r>
+      <w:r>
+        <w:t xml:space="preserve"> с события </w:t>
+      </w:r>
+      <w:r>
+        <w:t>“</w:t>
+      </w:r>
+      <w:r>
+        <w:t>Тестирование видеоигры</w:t>
+      </w:r>
+      <w:r>
+        <w:t>”</w:t>
+      </w:r>
+    </w:p>
+    <w:p>
+      <w:pPr>
+        <w:pStyle w:val="ab"/>
+        <w:numPr>
+          <w:ilvl w:val="0"/>
+          <w:numId w:val="2"/>
+        </w:numPr>
+        <w:spacing w:line="360" w:lineRule="auto"/>
+        <w:ind w:left="0" w:firstLine="709"/>
+      </w:pPr>
+      <w:r>
+        <w:t>“</w:t>
+      </w:r>
+      <w:r>
+        <w:t>Имеющиеся тесты</w:t>
+      </w:r>
+      <w:r>
+        <w:t>”</w:t>
+      </w:r>
+      <w:r>
+        <w:t xml:space="preserve"> с хранилища данных </w:t>
+      </w:r>
+      <w:r>
+        <w:t>“</w:t>
+      </w:r>
+      <w:r>
+        <w:t xml:space="preserve">2 </w:t>
+      </w:r>
+      <w:r>
+        <w:t xml:space="preserve">| </w:t>
+      </w:r>
+      <w:r>
+        <w:t>Тесты</w:t>
+      </w:r>
+      <w:r>
+        <w:t>”</w:t>
+      </w:r>
+      <w:r>
+        <w:t>.</w:t>
+      </w:r>
+    </w:p>
+    <w:p>
+      <w:pPr>
         <w:spacing w:after="160" w:line="278" w:lineRule="auto"/>
       </w:pPr>
-      <w:r>
-        <w:t>2.</w:t>
-      </w:r>
-      <w:r>
-        <w:t>6</w:t>
-      </w:r>
-      <w:r>
-        <w:t xml:space="preserve"> – </w:t>
-      </w:r>
-      <w:r>
-        <w:t>Постро</w:t>
-      </w:r>
-      <w:r>
-        <w:t>ение</w:t>
-      </w:r>
-      <w:r>
-        <w:t xml:space="preserve"> DFD-диаграмм</w:t>
-      </w:r>
-      <w:r>
-        <w:t>ы</w:t>
-      </w:r>
-      <w:r>
-        <w:t xml:space="preserve"> главного (основного) процесса.</w:t>
-      </w:r>
-    </w:p>
-    <w:p>
-      <w:pPr>
-        <w:spacing w:after="160" w:line="278" w:lineRule="auto"/>
-      </w:pPr>
-    </w:p>
-    <w:p>
-      <w:pPr>
-        <w:spacing w:after="160" w:line="278" w:lineRule="auto"/>
-      </w:pPr>
-      <w:r>
-        <w:t>2.</w:t>
-      </w:r>
-      <w:r>
-        <w:t>7</w:t>
-      </w:r>
-      <w:r>
-        <w:t xml:space="preserve"> – </w:t>
-      </w:r>
-      <w:r>
-        <w:t>Составление</w:t>
-      </w:r>
-      <w:r>
-        <w:t xml:space="preserve"> декомпозици</w:t>
-      </w:r>
-      <w:r>
-        <w:t>и</w:t>
-      </w:r>
-      <w:r>
-        <w:t xml:space="preserve"> (детализацию).</w:t>
-      </w:r>
-    </w:p>
-    <w:p>
-      <w:pPr>
-        <w:spacing w:after="160" w:line="278" w:lineRule="auto"/>
-      </w:pPr>
-      <w:r>
-        <w:t>2.8 – П</w:t>
-      </w:r>
-      <w:r>
-        <w:t>остро</w:t>
-      </w:r>
-      <w:r>
-        <w:t>ение</w:t>
-      </w:r>
-      <w:r>
-        <w:t xml:space="preserve"> таблиц</w:t>
-      </w:r>
-      <w:r>
-        <w:t>ы</w:t>
-      </w:r>
-      <w:r>
-        <w:t xml:space="preserve"> внутренних событий аналогично таблице 1.3</w:t>
-      </w:r>
-      <w:r>
-        <w:t xml:space="preserve"> д</w:t>
-      </w:r>
-      <w:r>
-        <w:t>ля каждого полученного подпроцесса.</w:t>
-      </w:r>
-    </w:p>
-    <w:p>
-      <w:pPr>
-        <w:spacing w:after="160" w:line="278" w:lineRule="auto"/>
-      </w:pPr>
-      <w:r>
-        <w:t xml:space="preserve">2.8 – </w:t>
-      </w:r>
-      <w:r>
-        <w:t>Выдел</w:t>
-      </w:r>
-      <w:r>
-        <w:t>ение</w:t>
-      </w:r>
-      <w:r>
-        <w:t xml:space="preserve"> поток</w:t>
-      </w:r>
-      <w:r>
-        <w:t>ов</w:t>
-      </w:r>
-      <w:r>
-        <w:t xml:space="preserve"> данных, которыми обмениваются процессы и внешние сущности, выдел</w:t>
-      </w:r>
-      <w:r>
-        <w:t>ение</w:t>
-      </w:r>
-      <w:r>
-        <w:t xml:space="preserve"> поставщиков и потребителей информации</w:t>
+    </w:p>
+    <w:p>
+      <w:pPr>
+        <w:spacing w:line="360" w:lineRule="auto"/>
+      </w:pPr>
+      <w:r>
+        <w:t xml:space="preserve">Событие </w:t>
+      </w:r>
+      <w:r>
+        <w:t>“</w:t>
+      </w:r>
+      <w:r>
+        <w:t>Модификация видеоигрового процесса</w:t>
+      </w:r>
+      <w:r>
+        <w:t xml:space="preserve">”: </w:t>
+      </w:r>
+    </w:p>
+    <w:p>
+      <w:pPr>
+        <w:spacing w:line="360" w:lineRule="auto"/>
+      </w:pPr>
+      <w:r>
+        <w:t>Выходы</w:t>
+      </w:r>
+      <w:r>
+        <w:t>:</w:t>
       </w:r>
       <w:r>
         <w:t xml:space="preserve"> </w:t>
       </w:r>
-      <w:r>
-        <w:t>для каждого из внутренних процессов.</w:t>
-      </w:r>
-    </w:p>
-    <w:p>
-      <w:pPr>
-        <w:spacing w:after="160" w:line="278" w:lineRule="auto"/>
-      </w:pPr>
-      <w:r>
-        <w:t xml:space="preserve">2.9 – </w:t>
-      </w:r>
-      <w:r>
-        <w:t>Построить DFD-диаграмму детализации основного процесса.</w:t>
-      </w:r>
-    </w:p>
-    <w:p>
-      <w:pPr>
-        <w:spacing w:after="160" w:line="278" w:lineRule="auto"/>
-      </w:pPr>
+    </w:p>
+    <w:p>
+      <w:pPr>
+        <w:pStyle w:val="ab"/>
+        <w:numPr>
+          <w:ilvl w:val="0"/>
+          <w:numId w:val="2"/>
+        </w:numPr>
+        <w:spacing w:line="360" w:lineRule="auto"/>
+        <w:ind w:left="0" w:firstLine="709"/>
+      </w:pPr>
+      <w:r>
+        <w:t>“</w:t>
+      </w:r>
+      <w:r>
+        <w:t>Отчёт о применении модификаций</w:t>
+      </w:r>
+      <w:r>
+        <w:t>”</w:t>
+      </w:r>
+      <w:r>
+        <w:t xml:space="preserve"> на </w:t>
+      </w:r>
+      <w:r>
+        <w:t>внешнюю сущность</w:t>
+      </w:r>
+      <w:r>
+        <w:t xml:space="preserve"> </w:t>
+      </w:r>
+      <w:r>
+        <w:t>“</w:t>
+      </w:r>
+      <w:r>
+        <w:t>Команда разработки</w:t>
+      </w:r>
+      <w:r>
+        <w:t>”</w:t>
+      </w:r>
+      <w:r>
+        <w:t>,</w:t>
+      </w:r>
+    </w:p>
+    <w:p>
+      <w:pPr>
+        <w:pStyle w:val="ab"/>
+        <w:numPr>
+          <w:ilvl w:val="0"/>
+          <w:numId w:val="2"/>
+        </w:numPr>
+        <w:spacing w:line="360" w:lineRule="auto"/>
+        <w:ind w:left="0" w:firstLine="709"/>
+      </w:pPr>
+      <w:r>
+        <w:t>“</w:t>
+      </w:r>
+      <w:r>
+        <w:t>Новый ввод</w:t>
+      </w:r>
+      <w:r>
+        <w:t>”</w:t>
+      </w:r>
+      <w:r>
+        <w:t xml:space="preserve"> на хранилище данных </w:t>
+      </w:r>
+      <w:r>
+        <w:t>“</w:t>
+      </w:r>
+      <w:r>
+        <w:t xml:space="preserve">1 </w:t>
+      </w:r>
+      <w:r>
+        <w:t xml:space="preserve">| </w:t>
+      </w:r>
+      <w:r>
+        <w:t>Отслеживаемый ввод</w:t>
+      </w:r>
+      <w:r>
+        <w:t>”</w:t>
+      </w:r>
+    </w:p>
+    <w:p>
+      <w:pPr>
+        <w:spacing w:line="360" w:lineRule="auto"/>
+        <w:rPr>
+          <w:lang w:val="en-US"/>
+        </w:rPr>
+      </w:pPr>
+      <w:r>
+        <w:t>Входы</w:t>
+      </w:r>
+      <w:r>
+        <w:t>:</w:t>
+      </w:r>
+      <w:r>
+        <w:t xml:space="preserve"> </w:t>
+      </w:r>
+    </w:p>
+    <w:p>
+      <w:pPr>
+        <w:pStyle w:val="ab"/>
+        <w:numPr>
+          <w:ilvl w:val="0"/>
+          <w:numId w:val="2"/>
+        </w:numPr>
+        <w:spacing w:line="360" w:lineRule="auto"/>
+        <w:ind w:left="0" w:firstLine="709"/>
+      </w:pPr>
+      <w:r>
+        <w:t>“</w:t>
+      </w:r>
+      <w:r>
+        <w:t>Опыт в создании модификаций в системе</w:t>
+      </w:r>
+      <w:r>
+        <w:t>”</w:t>
+      </w:r>
+      <w:r>
+        <w:t xml:space="preserve"> с внешней сущности </w:t>
+      </w:r>
+      <w:r>
+        <w:t>“</w:t>
+      </w:r>
+      <w:r>
+        <w:t>Команда разработки</w:t>
+      </w:r>
+      <w:r>
+        <w:t>”</w:t>
+      </w:r>
+      <w:r>
+        <w:t xml:space="preserve">, </w:t>
+      </w:r>
+    </w:p>
+    <w:p>
+      <w:pPr>
+        <w:pStyle w:val="ab"/>
+        <w:numPr>
+          <w:ilvl w:val="0"/>
+          <w:numId w:val="2"/>
+        </w:numPr>
+        <w:spacing w:line="360" w:lineRule="auto"/>
+        <w:ind w:left="0" w:firstLine="709"/>
+      </w:pPr>
+      <w:r>
+        <w:t>“</w:t>
+      </w:r>
+      <w:r>
+        <w:t>Имеющийся ввод</w:t>
+      </w:r>
+      <w:r>
+        <w:t>”</w:t>
+      </w:r>
+      <w:r>
+        <w:t xml:space="preserve"> с хранилища данных </w:t>
+      </w:r>
+      <w:r>
+        <w:t xml:space="preserve">“1 | </w:t>
+      </w:r>
+      <w:r>
+        <w:t>Отслеживаемый ввод</w:t>
+      </w:r>
+      <w:r>
+        <w:t>”</w:t>
+      </w:r>
+    </w:p>
+    <w:p>
+      <w:pPr>
+        <w:pStyle w:val="ab"/>
+        <w:numPr>
+          <w:ilvl w:val="0"/>
+          <w:numId w:val="2"/>
+        </w:numPr>
+        <w:spacing w:line="360" w:lineRule="auto"/>
+        <w:ind w:left="0" w:firstLine="709"/>
+      </w:pPr>
+      <w:r>
+        <w:t>“</w:t>
+      </w:r>
+      <w:r>
+        <w:t>Имеющиеся тесты</w:t>
+      </w:r>
+      <w:r>
+        <w:t>”</w:t>
+      </w:r>
+      <w:r>
+        <w:t xml:space="preserve"> с хранилища данных </w:t>
+      </w:r>
+      <w:r>
+        <w:t>“</w:t>
+      </w:r>
+      <w:r>
+        <w:t xml:space="preserve">2 </w:t>
+      </w:r>
+      <w:r>
+        <w:t xml:space="preserve">| </w:t>
+      </w:r>
+      <w:r>
+        <w:t>Тесты</w:t>
+      </w:r>
+      <w:r>
+        <w:t>”</w:t>
+      </w:r>
+      <w:r>
+        <w:t>.</w:t>
+      </w:r>
     </w:p>
     <w:p>
       <w:pPr>
         <w:spacing w:after="160" w:line="278" w:lineRule="auto"/>
         <w:ind w:firstLine="0"/>
-        <w:jc w:val="left"/>
+      </w:pPr>
+    </w:p>
+    <w:p>
+      <w:pPr>
+        <w:spacing w:after="160" w:line="278" w:lineRule="auto"/>
+      </w:pPr>
+      <w:r>
+        <w:lastRenderedPageBreak/>
+        <w:t xml:space="preserve">2.9 – </w:t>
+      </w:r>
+      <w:r>
+        <w:t>Построить DFD-диаграмму детализации основного процесса</w:t>
+      </w:r>
+      <w:r>
+        <w:t xml:space="preserve"> (Рисунок Б.2).</w:t>
+      </w:r>
+    </w:p>
+    <w:p>
+      <w:pPr>
+        <w:spacing w:after="160" w:line="278" w:lineRule="auto"/>
+        <w:ind w:firstLine="0"/>
+      </w:pPr>
+    </w:p>
+    <w:p>
+      <w:pPr>
+        <w:ind w:firstLine="0"/>
+        <w:jc w:val="center"/>
         <w:rPr>
           <w:b/>
           <w:bCs/>
         </w:rPr>
       </w:pPr>
-    </w:p>
-    <w:p>
-      <w:pPr>
-        <w:spacing w:after="160" w:line="278" w:lineRule="auto"/>
-        <w:ind w:firstLine="0"/>
-        <w:jc w:val="left"/>
+      <w:r>
         <w:rPr>
           <w:b/>
           <w:bCs/>
         </w:rPr>
-      </w:pPr>
-      <w:r>
-        <w:rPr>
-          <w:b/>
-          <w:bCs/>
-        </w:rPr>
-        <w:br w:type="page"/>
-      </w:r>
-    </w:p>
-    <w:p>
-      <w:pPr>
-        <w:ind w:firstLine="0"/>
-        <w:jc w:val="center"/>
-        <w:rPr>
-          <w:b/>
-          <w:bCs/>
-        </w:rPr>
-      </w:pPr>
-      <w:r>
-        <w:rPr>
-          <w:b/>
-          <w:bCs/>
-        </w:rPr>
-        <w:lastRenderedPageBreak/>
         <w:t xml:space="preserve">Выводы </w:t>
       </w:r>
     </w:p>
@@ -3984,13 +6107,202 @@
     </w:p>
     <w:p>
       <w:pPr>
+        <w:spacing w:after="160" w:line="278" w:lineRule="auto"/>
+        <w:ind w:firstLine="0"/>
+        <w:jc w:val="left"/>
+      </w:pPr>
+      <w:r>
+        <w:br w:type="page"/>
+      </w:r>
+    </w:p>
+    <w:p>
+      <w:pPr>
         <w:ind w:firstLine="0"/>
         <w:jc w:val="center"/>
+      </w:pPr>
+      <w:r>
+        <w:lastRenderedPageBreak/>
+        <w:t>ПРИЛОЖЕНИЕ Б</w:t>
+      </w:r>
+    </w:p>
+    <w:p>
+      <w:pPr>
+        <w:ind w:firstLine="0"/>
+        <w:jc w:val="center"/>
         <w:rPr>
           <w:b/>
           <w:bCs/>
         </w:rPr>
       </w:pPr>
+    </w:p>
+    <w:p>
+      <w:pPr>
+        <w:spacing w:after="160" w:line="278" w:lineRule="auto"/>
+        <w:ind w:firstLine="0"/>
+        <w:jc w:val="center"/>
+      </w:pPr>
+      <w:r>
+        <w:rPr>
+          <w:noProof/>
+        </w:rPr>
+        <w:drawing>
+          <wp:inline distT="0" distB="0" distL="0" distR="0" wp14:anchorId="2C464C03" wp14:editId="7981C273">
+            <wp:extent cx="4139209" cy="4219575"/>
+            <wp:effectExtent l="0" t="0" r="0" b="0"/>
+            <wp:docPr id="1" name="Рисунок 1"/>
+            <wp:cNvGraphicFramePr>
+              <a:graphicFrameLocks xmlns:a="http://schemas.openxmlformats.org/drawingml/2006/main" noChangeAspect="1"/>
+            </wp:cNvGraphicFramePr>
+            <a:graphic xmlns:a="http://schemas.openxmlformats.org/drawingml/2006/main">
+              <a:graphicData uri="http://schemas.openxmlformats.org/drawingml/2006/picture">
+                <pic:pic xmlns:pic="http://schemas.openxmlformats.org/drawingml/2006/picture">
+                  <pic:nvPicPr>
+                    <pic:cNvPr id="1" name=""/>
+                    <pic:cNvPicPr/>
+                  </pic:nvPicPr>
+                  <pic:blipFill rotWithShape="1">
+                    <a:blip r:embed="rId21"/>
+                    <a:srcRect r="34369"/>
+                    <a:stretch/>
+                  </pic:blipFill>
+                  <pic:spPr bwMode="auto">
+                    <a:xfrm>
+                      <a:off x="0" y="0"/>
+                      <a:ext cx="4159227" cy="4239982"/>
+                    </a:xfrm>
+                    <a:prstGeom prst="rect">
+                      <a:avLst/>
+                    </a:prstGeom>
+                    <a:ln>
+                      <a:noFill/>
+                    </a:ln>
+                    <a:extLst>
+                      <a:ext uri="{53640926-AAD7-44D8-BBD7-CCE9431645EC}">
+                        <a14:shadowObscured xmlns:a14="http://schemas.microsoft.com/office/drawing/2010/main"/>
+                      </a:ext>
+                    </a:extLst>
+                  </pic:spPr>
+                </pic:pic>
+              </a:graphicData>
+            </a:graphic>
+          </wp:inline>
+        </w:drawing>
+      </w:r>
+    </w:p>
+    <w:p>
+      <w:pPr>
+        <w:spacing w:after="160" w:line="278" w:lineRule="auto"/>
+        <w:ind w:firstLine="0"/>
+        <w:jc w:val="center"/>
+      </w:pPr>
+      <w:r>
+        <w:t xml:space="preserve">Рисунок </w:t>
+      </w:r>
+      <w:r>
+        <w:t>Б.</w:t>
+      </w:r>
+      <w:r>
+        <w:t xml:space="preserve">1 – </w:t>
+      </w:r>
+      <w:r>
+        <w:rPr>
+          <w:lang w:val="en-US"/>
+        </w:rPr>
+        <w:t>DFD</w:t>
+      </w:r>
+      <w:r>
+        <w:t>-</w:t>
+      </w:r>
+      <w:r>
+        <w:t>диаграмма главного процесса</w:t>
+      </w:r>
+    </w:p>
+    <w:p>
+      <w:pPr>
+        <w:ind w:firstLine="0"/>
+        <w:jc w:val="center"/>
+        <w:rPr>
+          <w:b/>
+          <w:bCs/>
+        </w:rPr>
+      </w:pPr>
+    </w:p>
+    <w:p>
+      <w:pPr>
+        <w:spacing w:after="160" w:line="278" w:lineRule="auto"/>
+        <w:ind w:firstLine="0"/>
+        <w:jc w:val="center"/>
+        <w:rPr>
+          <w:b/>
+          <w:bCs/>
+        </w:rPr>
+      </w:pPr>
+      <w:r>
+        <w:rPr>
+          <w:b/>
+          <w:bCs/>
+        </w:rPr>
+        <w:drawing>
+          <wp:inline distT="0" distB="0" distL="0" distR="0" wp14:anchorId="5FF0D192" wp14:editId="3DA9F607">
+            <wp:extent cx="4848225" cy="3215739"/>
+            <wp:effectExtent l="0" t="0" r="0" b="3810"/>
+            <wp:docPr id="2" name="Рисунок 2"/>
+            <wp:cNvGraphicFramePr>
+              <a:graphicFrameLocks xmlns:a="http://schemas.openxmlformats.org/drawingml/2006/main" noChangeAspect="1"/>
+            </wp:cNvGraphicFramePr>
+            <a:graphic xmlns:a="http://schemas.openxmlformats.org/drawingml/2006/main">
+              <a:graphicData uri="http://schemas.openxmlformats.org/drawingml/2006/picture">
+                <pic:pic xmlns:pic="http://schemas.openxmlformats.org/drawingml/2006/picture">
+                  <pic:nvPicPr>
+                    <pic:cNvPr id="1" name=""/>
+                    <pic:cNvPicPr/>
+                  </pic:nvPicPr>
+                  <pic:blipFill>
+                    <a:blip r:embed="rId22"/>
+                    <a:stretch>
+                      <a:fillRect/>
+                    </a:stretch>
+                  </pic:blipFill>
+                  <pic:spPr>
+                    <a:xfrm>
+                      <a:off x="0" y="0"/>
+                      <a:ext cx="4852961" cy="3218880"/>
+                    </a:xfrm>
+                    <a:prstGeom prst="rect">
+                      <a:avLst/>
+                    </a:prstGeom>
+                  </pic:spPr>
+                </pic:pic>
+              </a:graphicData>
+            </a:graphic>
+          </wp:inline>
+        </w:drawing>
+      </w:r>
+    </w:p>
+    <w:p>
+      <w:pPr>
+        <w:spacing w:after="160" w:line="278" w:lineRule="auto"/>
+        <w:ind w:firstLine="0"/>
+        <w:jc w:val="center"/>
+      </w:pPr>
+      <w:r>
+        <w:t xml:space="preserve">Рисунок </w:t>
+      </w:r>
+      <w:r>
+        <w:t>Б.</w:t>
+      </w:r>
+      <w:r>
+        <w:t xml:space="preserve">2 </w:t>
+      </w:r>
+      <w:r>
+        <w:t>–</w:t>
+      </w:r>
+      <w:r>
+        <w:t xml:space="preserve"> </w:t>
+      </w:r>
+      <w:r>
+        <w:t>Детализация основного процесса</w:t>
+      </w:r>
     </w:p>
     <w:sectPr>
       <w:pgSz w:w="11906" w:h="16838"/>
@@ -4003,7 +6315,7 @@
 </file>
 
 <file path=word/numbering.xml><?xml version="1.0" encoding="utf-8"?>
-<w:numbering xmlns:wpc="http://schemas.microsoft.com/office/word/2010/wordprocessingCanvas" xmlns:cx="http://schemas.microsoft.com/office/drawing/2014/chartex" xmlns:cx1="http://schemas.microsoft.com/office/drawing/2015/9/8/chartex" xmlns:cx2="http://schemas.microsoft.com/office/drawing/2015/10/21/chartex" xmlns:cx3="http://schemas.microsoft.com/office/drawing/2016/5/9/chartex" xmlns:cx4="http://schemas.microsoft.com/office/drawing/2016/5/10/chartex" xmlns:cx5="http://schemas.microsoft.com/office/drawing/2016/5/11/chartex" xmlns:cx6="http://schemas.microsoft.com/office/drawing/2016/5/12/chartex" xmlns:cx7="http://schemas.microsoft.com/office/drawing/2016/5/13/chartex" xmlns:cx8="http://schemas.microsoft.com/office/drawing/2016/5/14/chartex" xmlns:mc="http://schemas.openxmlformats.org/markup-compatibility/2006" xmlns:aink="http://schemas.microsoft.com/office/drawing/2016/ink" xmlns:am3d="http://schemas.microsoft.com/office/drawing/2017/model3d" xmlns:o="urn:schemas-microsoft-com:office:office" xmlns:oel="http://schemas.microsoft.com/office/2019/extlst" xmlns:r="http://schemas.openxmlformats.org/officeDocument/2006/relationships" xmlns:m="http://schemas.openxmlformats.org/officeDocument/2006/math" xmlns:v="urn:schemas-microsoft-com:vml" xmlns:wp14="http://schemas.microsoft.com/office/word/2010/wordprocessingDrawing" xmlns:wp="http://schemas.openxmlformats.org/drawingml/2006/wordprocessingDrawing" xmlns:w10="urn:schemas-microsoft-com:office:word" xmlns:w="http://schemas.openxmlformats.org/wordprocessingml/2006/main" xmlns:w14="http://schemas.microsoft.com/office/word/2010/wordml" xmlns:w15="http://schemas.microsoft.com/office/word/2012/wordml" xmlns:w16cex="http://schemas.microsoft.com/office/word/2018/wordml/cex" xmlns:w16cid="http://schemas.microsoft.com/office/word/2016/wordml/cid" xmlns:w16="http://schemas.microsoft.com/office/word/2018/wordml" xmlns:w16du="http://schemas.microsoft.com/office/word/2023/wordml/word16du" xmlns:w16sdtdh="http://schemas.microsoft.com/office/word/2020/wordml/sdtdatahash" xmlns:w16sdtfl="http://schemas.microsoft.com/office/word/2024/wordml/sdtformatlock" xmlns:w16se="http://schemas.microsoft.com/office/word/2015/wordml/symex" xmlns:wpg="http://schemas.microsoft.com/office/word/2010/wordprocessingGroup" xmlns:wpi="http://schemas.microsoft.com/office/word/2010/wordprocessingInk" xmlns:wne="http://schemas.microsoft.com/office/word/2006/wordml" xmlns:wps="http://schemas.microsoft.com/office/word/2010/wordprocessingShape" mc:Ignorable="w14 w15 w16se w16cid w16 w16cex w16sdtdh w16sdtfl w16du wp14">
+<w:numbering xmlns:wpc="http://schemas.microsoft.com/office/word/2010/wordprocessingCanvas" xmlns:cx="http://schemas.microsoft.com/office/drawing/2014/chartex" xmlns:cx1="http://schemas.microsoft.com/office/drawing/2015/9/8/chartex" xmlns:cx2="http://schemas.microsoft.com/office/drawing/2015/10/21/chartex" xmlns:cx3="http://schemas.microsoft.com/office/drawing/2016/5/9/chartex" xmlns:cx4="http://schemas.microsoft.com/office/drawing/2016/5/10/chartex" xmlns:cx5="http://schemas.microsoft.com/office/drawing/2016/5/11/chartex" xmlns:cx6="http://schemas.microsoft.com/office/drawing/2016/5/12/chartex" xmlns:cx7="http://schemas.microsoft.com/office/drawing/2016/5/13/chartex" xmlns:cx8="http://schemas.microsoft.com/office/drawing/2016/5/14/chartex" xmlns:mc="http://schemas.openxmlformats.org/markup-compatibility/2006" xmlns:aink="http://schemas.microsoft.com/office/drawing/2016/ink" xmlns:am3d="http://schemas.microsoft.com/office/drawing/2017/model3d" xmlns:o="urn:schemas-microsoft-com:office:office" xmlns:r="http://schemas.openxmlformats.org/officeDocument/2006/relationships" xmlns:m="http://schemas.openxmlformats.org/officeDocument/2006/math" xmlns:v="urn:schemas-microsoft-com:vml" xmlns:wp14="http://schemas.microsoft.com/office/word/2010/wordprocessingDrawing" xmlns:wp="http://schemas.openxmlformats.org/drawingml/2006/wordprocessingDrawing" xmlns:w10="urn:schemas-microsoft-com:office:word" xmlns:w="http://schemas.openxmlformats.org/wordprocessingml/2006/main" xmlns:w14="http://schemas.microsoft.com/office/word/2010/wordml" xmlns:w15="http://schemas.microsoft.com/office/word/2012/wordml" xmlns:w16cex="http://schemas.microsoft.com/office/word/2018/wordml/cex" xmlns:w16cid="http://schemas.microsoft.com/office/word/2016/wordml/cid" xmlns:w16="http://schemas.microsoft.com/office/word/2018/wordml" xmlns:w16sdtdh="http://schemas.microsoft.com/office/word/2020/wordml/sdtdatahash" xmlns:w16se="http://schemas.microsoft.com/office/word/2015/wordml/symex" xmlns:wpg="http://schemas.microsoft.com/office/word/2010/wordprocessingGroup" xmlns:wpi="http://schemas.microsoft.com/office/word/2010/wordprocessingInk" xmlns:wne="http://schemas.microsoft.com/office/word/2006/wordml" xmlns:wps="http://schemas.microsoft.com/office/word/2010/wordprocessingShape" mc:Ignorable="w14 w15 w16se w16cid w16 w16cex w16sdtdh wp14">
   <w:abstractNum w:abstractNumId="0" w15:restartNumberingAfterBreak="0">
     <w:nsid w:val="489950C1"/>
     <w:multiLevelType w:val="hybridMultilevel"/>
@@ -4230,17 +6542,17 @@
       </w:rPr>
     </w:lvl>
   </w:abstractNum>
-  <w:num w:numId="1" w16cid:durableId="742992875">
+  <w:num w:numId="1">
     <w:abstractNumId w:val="1"/>
   </w:num>
-  <w:num w:numId="2" w16cid:durableId="1501390121">
+  <w:num w:numId="2">
     <w:abstractNumId w:val="0"/>
   </w:num>
 </w:numbering>
 </file>
 
 <file path=word/styles.xml><?xml version="1.0" encoding="utf-8"?>
-<w:styles xmlns:mc="http://schemas.openxmlformats.org/markup-compatibility/2006" xmlns:r="http://schemas.openxmlformats.org/officeDocument/2006/relationships" xmlns:w="http://schemas.openxmlformats.org/wordprocessingml/2006/main" xmlns:w14="http://schemas.microsoft.com/office/word/2010/wordml" xmlns:w15="http://schemas.microsoft.com/office/word/2012/wordml" xmlns:w16cex="http://schemas.microsoft.com/office/word/2018/wordml/cex" xmlns:w16cid="http://schemas.microsoft.com/office/word/2016/wordml/cid" xmlns:w16="http://schemas.microsoft.com/office/word/2018/wordml" xmlns:w16du="http://schemas.microsoft.com/office/word/2023/wordml/word16du" xmlns:w16sdtdh="http://schemas.microsoft.com/office/word/2020/wordml/sdtdatahash" xmlns:w16sdtfl="http://schemas.microsoft.com/office/word/2024/wordml/sdtformatlock" xmlns:w16se="http://schemas.microsoft.com/office/word/2015/wordml/symex" mc:Ignorable="w14 w15 w16se w16cid w16 w16cex w16sdtdh w16sdtfl w16du">
+<w:styles xmlns:mc="http://schemas.openxmlformats.org/markup-compatibility/2006" xmlns:r="http://schemas.openxmlformats.org/officeDocument/2006/relationships" xmlns:w="http://schemas.openxmlformats.org/wordprocessingml/2006/main" xmlns:w14="http://schemas.microsoft.com/office/word/2010/wordml" xmlns:w15="http://schemas.microsoft.com/office/word/2012/wordml" xmlns:w16cex="http://schemas.microsoft.com/office/word/2018/wordml/cex" xmlns:w16cid="http://schemas.microsoft.com/office/word/2016/wordml/cid" xmlns:w16="http://schemas.microsoft.com/office/word/2018/wordml" xmlns:w16sdtdh="http://schemas.microsoft.com/office/word/2020/wordml/sdtdatahash" xmlns:w16se="http://schemas.microsoft.com/office/word/2015/wordml/symex" mc:Ignorable="w14 w15 w16se w16cid w16 w16cex w16sdtdh">
   <w:docDefaults>
     <w:rPrDefault>
       <w:rPr>
@@ -4848,6 +7160,7 @@
   <w:style w:type="character" w:default="1" w:styleId="a0">
     <w:name w:val="Default Paragraph Font"/>
     <w:uiPriority w:val="1"/>
+    <w:semiHidden/>
     <w:unhideWhenUsed/>
   </w:style>
   <w:style w:type="table" w:default="1" w:styleId="a1">

</xml_diff>